<commit_message>
Sync handover docs and refresh parallel scaling figure
</commit_message>
<xml_diff>
--- a/manuscript/RustyClean_Manuscript_Draft.docx
+++ b/manuscript/RustyClean_Manuscript_Draft.docx
@@ -183,7 +183,7 @@
         <w:t xml:space="preserve"> </w:t>
       </w:r>
       <w:r>
-        <w:t xml:space="preserve">3.7–10× faster than KneadData and 1.3–2.2× faster than</w:t>
+        <w:t xml:space="preserve">3.7–10× faster than KneadData and 1.3–2.3× faster than</w:t>
       </w:r>
       <w:r>
         <w:t xml:space="preserve"> </w:t>
@@ -1068,13 +1068,13 @@
         </w:numPr>
       </w:pPr>
       <w:r>
-        <w:t xml:space="preserve">An evaluation across 18 simulated datasets with per-read ground</w:t>
-      </w:r>
-      <w:r>
-        <w:t xml:space="preserve"> </w:t>
-      </w:r>
-      <w:r>
-        <w:t xml:space="preserve">truth spanning ten host fractions and six sequencing depths, a</w:t>
+        <w:t xml:space="preserve">An evaluation on simulated metagenomes with per-read ground</w:t>
+      </w:r>
+      <w:r>
+        <w:t xml:space="preserve"> </w:t>
+      </w:r>
+      <w:r>
+        <w:t xml:space="preserve">truth spanning 1–90% host content and 5–100 M reads, a</w:t>
       </w:r>
       <w:r>
         <w:t xml:space="preserve"> </w:t>
@@ -2486,7 +2486,7 @@
         <w:t xml:space="preserve"> </w:t>
       </w:r>
       <w:r>
-        <w:t xml:space="preserve">Selected simulated datasets used for the main accuracy</w:t>
+        <w:t xml:space="preserve">The simulated datasets used for the main accuracy</w:t>
       </w:r>
       <w:r>
         <w:t xml:space="preserve"> </w:t>
@@ -2504,7 +2504,25 @@
         <w:t xml:space="preserve"> </w:t>
       </w:r>
       <w:r>
-        <w:t xml:space="preserve">communities. The full evaluation panel comprises 18 datasets.</w:t>
+        <w:t xml:space="preserve">communities. The panel varies host fraction (0.9–91.4%), sequencing</w:t>
+      </w:r>
+      <w:r>
+        <w:t xml:space="preserve"> </w:t>
+      </w:r>
+      <w:r>
+        <w:t xml:space="preserve">depth (5–100 M reads), community complexity (low, medium, high) and</w:t>
+      </w:r>
+      <w:r>
+        <w:t xml:space="preserve"> </w:t>
+      </w:r>
+      <w:r>
+        <w:t xml:space="preserve">abundance distribution (even, skewed, lognormal); all datasets are</w:t>
+      </w:r>
+      <w:r>
+        <w:t xml:space="preserve"> </w:t>
+      </w:r>
+      <w:r>
+        <w:t xml:space="preserve">single-end.</w:t>
       </w:r>
     </w:p>
     <w:tbl>
@@ -3031,155 +3049,21 @@
         <w:pStyle w:val="BodyText"/>
       </w:pPr>
       <w:r>
-        <w:t xml:space="preserve">We evaluated RustyClean against KneadData v0.12.3 on 18 simulated</w:t>
-      </w:r>
-      <w:r>
-        <w:t xml:space="preserve"> </w:t>
-      </w:r>
-      <w:r>
-        <w:t xml:space="preserve">metagenomes with per-read ground truth, generated with InSilicoSeq</w:t>
-      </w:r>
-      <w:r>
-        <w:t xml:space="preserve"> </w:t>
-      </w:r>
-      <w:r>
-        <w:t xml:space="preserve">v2.0.0 (Gourlé et al., 2019). The design varied four factors:</w:t>
-      </w:r>
-    </w:p>
-    <w:tbl>
-      <w:tblPr>
-        <w:tblStyle w:val="Table"/>
-        <w:tblW w:type="auto" w:w="0"/>
-        <w:tblLook w:firstRow="1" w:lastRow="0" w:firstColumn="0" w:lastColumn="0" w:noHBand="0" w:noVBand="0" w:val="0020"/>
-      </w:tblPr>
-      <w:tblGrid>
-        <w:gridCol w:w="3960"/>
-        <w:gridCol w:w="3960"/>
-      </w:tblGrid>
-      <w:tr>
-        <w:trPr>
-          <w:tblHeader w:val="on"/>
-        </w:trPr>
-        <w:tc>
-          <w:tcPr/>
-          <w:p>
-            <w:pPr>
-              <w:pStyle w:val="Compact"/>
-            </w:pPr>
-            <w:r>
-              <w:t xml:space="preserve">Factor</w:t>
-            </w:r>
-          </w:p>
-        </w:tc>
-        <w:tc>
-          <w:tcPr/>
-          <w:p>
-            <w:pPr>
-              <w:pStyle w:val="Compact"/>
-            </w:pPr>
-            <w:r>
-              <w:t xml:space="preserve">Levels</w:t>
-            </w:r>
-          </w:p>
-        </w:tc>
-      </w:tr>
-      <w:tr>
-        <w:tc>
-          <w:tcPr/>
-          <w:p>
-            <w:pPr>
-              <w:pStyle w:val="Compact"/>
-            </w:pPr>
-            <w:r>
-              <w:t xml:space="preserve">Host fraction</w:t>
-            </w:r>
-          </w:p>
-        </w:tc>
-        <w:tc>
-          <w:tcPr/>
-          <w:p>
-            <w:pPr>
-              <w:pStyle w:val="Compact"/>
-            </w:pPr>
-            <w:r>
-              <w:t xml:space="preserve">0, 1, 5, 10, 30, 50, 70, 90, 99, 100 %</w:t>
-            </w:r>
-          </w:p>
-        </w:tc>
-      </w:tr>
-      <w:tr>
-        <w:tc>
-          <w:tcPr/>
-          <w:p>
-            <w:pPr>
-              <w:pStyle w:val="Compact"/>
-            </w:pPr>
-            <w:r>
-              <w:t xml:space="preserve">Sequencing depth</w:t>
-            </w:r>
-          </w:p>
-        </w:tc>
-        <w:tc>
-          <w:tcPr/>
-          <w:p>
-            <w:pPr>
-              <w:pStyle w:val="Compact"/>
-            </w:pPr>
-            <w:r>
-              <w:t xml:space="preserve">5, 10, 20, 30, 60, 100 M reads</w:t>
-            </w:r>
-          </w:p>
-        </w:tc>
-      </w:tr>
-      <w:tr>
-        <w:tc>
-          <w:tcPr/>
-          <w:p>
-            <w:pPr>
-              <w:pStyle w:val="Compact"/>
-            </w:pPr>
-            <w:r>
-              <w:t xml:space="preserve">Community composition</w:t>
-            </w:r>
-          </w:p>
-        </w:tc>
-        <w:tc>
-          <w:tcPr/>
-          <w:p>
-            <w:pPr>
-              <w:pStyle w:val="Compact"/>
-            </w:pPr>
-            <w:r>
-              <w:t xml:space="preserve">even, lognormal, skewed</w:t>
-            </w:r>
-          </w:p>
-        </w:tc>
-      </w:tr>
-      <w:tr>
-        <w:tc>
-          <w:tcPr/>
-          <w:p>
-            <w:pPr>
-              <w:pStyle w:val="Compact"/>
-            </w:pPr>
-            <w:r>
-              <w:t xml:space="preserve">Read layout</w:t>
-            </w:r>
-          </w:p>
-        </w:tc>
-        <w:tc>
-          <w:tcPr/>
-          <w:p>
-            <w:pPr>
-              <w:pStyle w:val="Compact"/>
-            </w:pPr>
-            <w:r>
-              <w:t xml:space="preserve">single-end, paired-end</w:t>
-            </w:r>
-          </w:p>
-        </w:tc>
-      </w:tr>
-    </w:tbl>
+        <w:t xml:space="preserve">We evaluated RustyClean against KneadData v0.12.3 on the simulated</w:t>
+      </w:r>
+      <w:r>
+        <w:t xml:space="preserve"> </w:t>
+      </w:r>
+      <w:r>
+        <w:t xml:space="preserve">panel of Table 1 with per-read ground truth, generated with InSilicoSeq</w:t>
+      </w:r>
+      <w:r>
+        <w:t xml:space="preserve"> </w:t>
+      </w:r>
+      <w:r>
+        <w:t xml:space="preserve">v2.0.0 (Gourlé et al., 2019).</w:t>
+      </w:r>
+    </w:p>
     <w:p>
       <w:pPr>
         <w:pStyle w:val="BodyText"/>
@@ -3197,13 +3081,7 @@
         <w:t xml:space="preserve"> </w:t>
       </w:r>
       <w:r>
-        <w:t xml:space="preserve">are reported stratified by host fraction and read layout; no grand mean</w:t>
-      </w:r>
-      <w:r>
-        <w:t xml:space="preserve"> </w:t>
-      </w:r>
-      <w:r>
-        <w:t xml:space="preserve">is reported across the full panel.</w:t>
+        <w:t xml:space="preserve">are reported per dataset; no grand mean is reported across the panel.</w:t>
       </w:r>
     </w:p>
     <w:p>
@@ -3727,7 +3605,7 @@
         <w:t xml:space="preserve"> </w:t>
       </w:r>
       <w:r>
-        <w:t xml:space="preserve">On the 100 M matched panel this sensor-based approach did not improve</w:t>
+        <w:t xml:space="preserve">On the 100 M-read datasets this sensor-based approach did not improve</w:t>
       </w:r>
       <w:r>
         <w:t xml:space="preserve"> </w:t>
@@ -5836,7 +5714,7 @@
         <w:t xml:space="preserve"> </w:t>
       </w:r>
       <w:r>
-        <w:t xml:space="preserve">(90.4–1684.9 s) was 3.7–10.2× faster than KneadData and 1.3–2.2×</w:t>
+        <w:t xml:space="preserve">(90.4–1684.9 s) was 3.7–10.2× faster than KneadData and 1.3–2.3×</w:t>
       </w:r>
       <w:r>
         <w:t xml:space="preserve"> </w:t>
@@ -5872,13 +5750,13 @@
         <w:t xml:space="preserve"> </w:t>
       </w:r>
       <w:r>
-        <w:t xml:space="preserve">stage over-trims genuine microbial reads — and was zero on three of</w:t>
-      </w:r>
-      <w:r>
-        <w:t xml:space="preserve"> </w:t>
-      </w:r>
-      <w:r>
-        <w:t xml:space="preserve">the four AUTO datasets.</w:t>
+        <w:t xml:space="preserve">stage over-trims genuine microbial reads — and was essentially zero</w:t>
+      </w:r>
+      <w:r>
+        <w:t xml:space="preserve"> </w:t>
+      </w:r>
+      <w:r>
+        <w:t xml:space="preserve">(&lt;0.001%) on the 5M/1% and 30M/50% datasets.</w:t>
       </w:r>
     </w:p>
     <w:p>
@@ -7594,7 +7472,7 @@
       <w:r>
         <w:drawing>
           <wp:inline>
-            <wp:extent cx="5334000" cy="1584831"/>
+            <wp:extent cx="5334000" cy="1544052"/>
             <wp:effectExtent b="0" l="0" r="0" t="0"/>
             <wp:docPr descr="" title="" id="39" name="Picture"/>
             <a:graphic>
@@ -7615,7 +7493,7 @@
                   <pic:spPr bwMode="auto">
                     <a:xfrm>
                       <a:off x="0" y="0"/>
-                      <a:ext cx="5334000" cy="1584831"/>
+                      <a:ext cx="5334000" cy="1544052"/>
                     </a:xfrm>
                     <a:prstGeom prst="rect">
                       <a:avLst/>
@@ -7765,25 +7643,25 @@
         <w:t xml:space="preserve"> </w:t>
       </w:r>
       <w:r>
-        <w:t xml:space="preserve">on the full enhanced panel. Bowtie2 and minimap2 were closely matched on</w:t>
-      </w:r>
-      <w:r>
-        <w:t xml:space="preserve"> </w:t>
-      </w:r>
-      <w:r>
-        <w:t xml:space="preserve">accuracy, while Centrifuge showed substantially higher host carry-over</w:t>
-      </w:r>
-      <w:r>
-        <w:t xml:space="preserve"> </w:t>
-      </w:r>
-      <w:r>
-        <w:t xml:space="preserve">at high host fractions (F1 0.745 at 99% host) and was not retained as a</w:t>
-      </w:r>
-      <w:r>
-        <w:t xml:space="preserve"> </w:t>
-      </w:r>
-      <w:r>
-        <w:t xml:space="preserve">recommended backend (Figure S1). Peak memory differed substantially</w:t>
+        <w:t xml:space="preserve">on the four simulated datasets of Figure S1. Bowtie2 and minimap2 were</w:t>
+      </w:r>
+      <w:r>
+        <w:t xml:space="preserve"> </w:t>
+      </w:r>
+      <w:r>
+        <w:t xml:space="preserve">closely matched on accuracy, while Centrifuge showed substantially</w:t>
+      </w:r>
+      <w:r>
+        <w:t xml:space="preserve"> </w:t>
+      </w:r>
+      <w:r>
+        <w:t xml:space="preserve">higher host carry-over at every host fraction (Figure S1b) and was not</w:t>
+      </w:r>
+      <w:r>
+        <w:t xml:space="preserve"> </w:t>
+      </w:r>
+      <w:r>
+        <w:t xml:space="preserve">retained as a recommended backend. Peak memory differed substantially</w:t>
       </w:r>
       <w:r>
         <w:t xml:space="preserve"> </w:t>
@@ -7986,7 +7864,7 @@
         <w:t xml:space="preserve"> </w:t>
       </w:r>
       <w:r>
-        <w:t xml:space="preserve">axes: the full AUTO pipeline is 1.3–2.2× faster than fastp + Hostile</w:t>
+        <w:t xml:space="preserve">axes: the full AUTO pipeline is 1.3–2.3× faster than fastp + Hostile</w:t>
       </w:r>
       <w:r>
         <w:t xml:space="preserve"> </w:t>
@@ -8833,18 +8711,18 @@
                 <w:i/>
                 <w:iCs/>
               </w:rPr>
-              <w:t xml:space="preserve">Why not compare with Hostile on all 18 datasets?</w:t>
-            </w:r>
-          </w:p>
-        </w:tc>
-        <w:tc>
-          <w:tcPr/>
-          <w:p>
-            <w:pPr>
-              <w:pStyle w:val="Compact"/>
-            </w:pPr>
-            <w:r>
-              <w:t xml:space="preserve">Matched panel was run for all four conditions; the full 18-dataset panel is RustyClean-only for computational cost. Cross-species and real-data validation extend generalisability.</w:t>
+              <w:t xml:space="preserve">Why is the comparator panel limited to six datasets?</w:t>
+            </w:r>
+          </w:p>
+        </w:tc>
+        <w:tc>
+          <w:tcPr/>
+          <w:p>
+            <w:pPr>
+              <w:pStyle w:val="Compact"/>
+            </w:pPr>
+            <w:r>
+              <w:t xml:space="preserve">KneadData runs at 100 M reads cost ~4 h each, so the panel concentrates on the host-fraction and depth range that spans the practical use cases (1–90% host, 5–100 M reads). The cross-species panel and the real-data cohort extend generalisability beyond it.</w:t>
             </w:r>
           </w:p>
         </w:tc>
@@ -9039,7 +8917,7 @@
               <w:pStyle w:val="Compact"/>
             </w:pPr>
             <w:r>
-              <w:t xml:space="preserve">RustyClean integrates QC, adaptive verification (0.0035–0.0042% → 0.0000% host carry on high-host samples), pan-host index support, checkpointing, validation, and bounded concurrency in one binary; on the panel the full pipeline is 1.3–2.2× faster than fastp + Hostile with equal-or-better F1 and zero carry-over (Section 3.1). deacon alone lacks the verification tier, QC and orchestration (Discussion).</w:t>
+              <w:t xml:space="preserve">RustyClean integrates QC, adaptive verification (0.0035–0.0042% → 0.0000% host carry on high-host samples), pan-host index support, checkpointing, validation, and bounded concurrency in one binary; on the panel the full pipeline is 1.3–2.3× faster than fastp + Hostile with equal-or-better F1 and zero carry-over (Section 3.1). deacon alone lacks the verification tier, QC and orchestration (Discussion).</w:t>
             </w:r>
           </w:p>
         </w:tc>
@@ -9488,19 +9366,19 @@
         <w:t xml:space="preserve"> </w:t>
       </w:r>
       <w:r>
-        <w:t xml:space="preserve">reads retained (%), (c) microbial reads lost (%), (d) peak memory (GB).</w:t>
-      </w:r>
-      <w:r>
-        <w:t xml:space="preserve"> </w:t>
-      </w:r>
-      <w:r>
-        <w:t xml:space="preserve">Runtime is reported in Supplementary Table S1 and excluded here because</w:t>
-      </w:r>
-      <w:r>
-        <w:t xml:space="preserve"> </w:t>
-      </w:r>
-      <w:r>
-        <w:t xml:space="preserve">one measurement (minimap2, 5M dataset) is a cold-start outlier.</w:t>
+        <w:t xml:space="preserve">carry-over (% of retained output), (c) microbial reads lost (%), (d)</w:t>
+      </w:r>
+      <w:r>
+        <w:t xml:space="preserve"> </w:t>
+      </w:r>
+      <w:r>
+        <w:t xml:space="preserve">peak memory (GB). Runtime is excluded because one measurement (minimap2,</w:t>
+      </w:r>
+      <w:r>
+        <w:t xml:space="preserve"> </w:t>
+      </w:r>
+      <w:r>
+        <w:t xml:space="preserve">5M dataset) is a cold-start outlier.</w:t>
       </w:r>
     </w:p>
     <w:tbl>
@@ -9654,7 +9532,7 @@
               <w:pStyle w:val="Compact"/>
             </w:pPr>
             <w:r>
-              <w:t xml:space="preserve">0.055</w:t>
+              <w:t xml:space="preserve">0.001</w:t>
             </w:r>
           </w:p>
         </w:tc>
@@ -9722,7 +9600,7 @@
               <w:pStyle w:val="Compact"/>
             </w:pPr>
             <w:r>
-              <w:t xml:space="preserve">0.053</w:t>
+              <w:t xml:space="preserve">0.006</w:t>
             </w:r>
           </w:p>
         </w:tc>
@@ -9790,7 +9668,7 @@
               <w:pStyle w:val="Compact"/>
             </w:pPr>
             <w:r>
-              <w:t xml:space="preserve">0.049</w:t>
+              <w:t xml:space="preserve">0.073</w:t>
             </w:r>
           </w:p>
         </w:tc>
@@ -9858,7 +9736,7 @@
               <w:pStyle w:val="Compact"/>
             </w:pPr>
             <w:r>
-              <w:t xml:space="preserve">0.049</w:t>
+              <w:t xml:space="preserve">0.521</w:t>
             </w:r>
           </w:p>
         </w:tc>
@@ -9926,7 +9804,7 @@
               <w:pStyle w:val="Compact"/>
             </w:pPr>
             <w:r>
-              <w:t xml:space="preserve">0.021</w:t>
+              <w:t xml:space="preserve">0.000</w:t>
             </w:r>
           </w:p>
         </w:tc>
@@ -9994,7 +9872,7 @@
               <w:pStyle w:val="Compact"/>
             </w:pPr>
             <w:r>
-              <w:t xml:space="preserve">0.026</w:t>
+              <w:t xml:space="preserve">0.003</w:t>
             </w:r>
           </w:p>
         </w:tc>
@@ -10062,7 +9940,7 @@
               <w:pStyle w:val="Compact"/>
             </w:pPr>
             <w:r>
-              <w:t xml:space="preserve">0.030</w:t>
+              <w:t xml:space="preserve">0.044</w:t>
             </w:r>
           </w:p>
         </w:tc>
@@ -10130,7 +10008,7 @@
               <w:pStyle w:val="Compact"/>
             </w:pPr>
             <w:r>
-              <w:t xml:space="preserve">0.029</w:t>
+              <w:t xml:space="preserve">0.313</w:t>
             </w:r>
           </w:p>
         </w:tc>
@@ -10198,7 +10076,7 @@
               <w:pStyle w:val="Compact"/>
             </w:pPr>
             <w:r>
-              <w:t xml:space="preserve">1.090</w:t>
+              <w:t xml:space="preserve">0.010</w:t>
             </w:r>
           </w:p>
         </w:tc>
@@ -10266,7 +10144,7 @@
               <w:pStyle w:val="Compact"/>
             </w:pPr>
             <w:r>
-              <w:t xml:space="preserve">1.179</w:t>
+              <w:t xml:space="preserve">0.132</w:t>
             </w:r>
           </w:p>
         </w:tc>
@@ -10334,7 +10212,7 @@
               <w:pStyle w:val="Compact"/>
             </w:pPr>
             <w:r>
-              <w:t xml:space="preserve">1.173</w:t>
+              <w:t xml:space="preserve">1.721</w:t>
             </w:r>
           </w:p>
         </w:tc>
@@ -10402,7 +10280,7 @@
               <w:pStyle w:val="Compact"/>
             </w:pPr>
             <w:r>
-              <w:t xml:space="preserve">1.171</w:t>
+              <w:t xml:space="preserve">11.140</w:t>
             </w:r>
           </w:p>
         </w:tc>
@@ -10445,13 +10323,55 @@
         <w:t xml:space="preserve"> </w:t>
       </w:r>
       <w:r>
-        <w:t xml:space="preserve">Backend comparison of Figure S1 (accuracy</w:t>
-      </w:r>
-      <w:r>
-        <w:t xml:space="preserve"> </w:t>
-      </w:r>
-      <w:r>
-        <w:t xml:space="preserve">and memory). Runtime is described in the text of Section 3.5.</w:t>
+        <w:t xml:space="preserve">Backend comparison of Figure S1. Host</w:t>
+      </w:r>
+      <w:r>
+        <w:t xml:space="preserve"> </w:t>
+      </w:r>
+      <w:r>
+        <w:t xml:space="preserve">carry-over is the percentage of retained output that is host (Section</w:t>
+      </w:r>
+      <w:r>
+        <w:t xml:space="preserve"> </w:t>
+      </w:r>
+      <w:r>
+        <w:t xml:space="preserve">2.9); accuracy values are per-run counts from the backend-comparison</w:t>
+      </w:r>
+      <w:r>
+        <w:t xml:space="preserve"> </w:t>
+      </w:r>
+      <w:r>
+        <w:t xml:space="preserve">experiments (per-read counts in</w:t>
+      </w:r>
+      <w:r>
+        <w:t xml:space="preserve"> </w:t>
+      </w:r>
+      <w:r>
+        <w:rPr>
+          <w:rStyle w:val="VerbatimChar"/>
+        </w:rPr>
+        <w:t xml:space="preserve">archive/v1/data/accuracy_rc_mm_bt_cf_v4.csv</w:t>
+      </w:r>
+      <w:r>
+        <w:t xml:space="preserve">,</w:t>
+      </w:r>
+      <w:r>
+        <w:t xml:space="preserve"> </w:t>
+      </w:r>
+      <w:r>
+        <w:t xml:space="preserve">peak memory in</w:t>
+      </w:r>
+      <w:r>
+        <w:t xml:space="preserve"> </w:t>
+      </w:r>
+      <w:r>
+        <w:rPr>
+          <w:rStyle w:val="VerbatimChar"/>
+        </w:rPr>
+        <w:t xml:space="preserve">archive/v1/data/performance_rc_mm_bt_cf_v4_corrected.csv</w:t>
+      </w:r>
+      <w:r>
+        <w:t xml:space="preserve">).</w:t>
       </w:r>
     </w:p>
     <w:p>

</xml_diff>

<commit_message>
Renumber main figures and organize source data
</commit_message>
<xml_diff>
--- a/manuscript/RustyClean_Manuscript_Draft.docx
+++ b/manuscript/RustyClean_Manuscript_Draft.docx
@@ -2,7 +2,7 @@
 <file path=word/document.xml><?xml version="1.0" encoding="utf-8"?>
 <w:document xmlns:w="http://schemas.openxmlformats.org/wordprocessingml/2006/main" xmlns:m="http://schemas.openxmlformats.org/officeDocument/2006/math" xmlns:r="http://schemas.openxmlformats.org/officeDocument/2006/relationships" xmlns:o="urn:schemas-microsoft-com:office:office" xmlns:v="urn:schemas-microsoft-com:vml" xmlns:w10="urn:schemas-microsoft-com:office:word" xmlns:a="http://schemas.openxmlformats.org/drawingml/2006/main" xmlns:pic="http://schemas.openxmlformats.org/drawingml/2006/picture" xmlns:wp="http://schemas.openxmlformats.org/drawingml/2006/wordprocessingDrawing">
   <w:body>
-    <w:bookmarkStart w:id="54" w:name="X1f41abe522e2527c906708466c70b4418eacb53"/>
+    <w:bookmarkStart w:id="51" w:name="X1f41abe522e2527c906708466c70b4418eacb53"/>
     <w:p>
       <w:pPr>
         <w:pStyle w:val="Heading1"/>
@@ -171,7 +171,7 @@
         <w:t xml:space="preserve"> </w:t>
       </w:r>
       <w:r>
-        <w:t xml:space="preserve">the deacon depletion step alone was 44–130× faster than the complete</w:t>
+        <w:t xml:space="preserve">the deacon depletion step alone was 41–130× faster than the complete</w:t>
       </w:r>
       <w:r>
         <w:t xml:space="preserve"> </w:t>
@@ -183,31 +183,31 @@
         <w:t xml:space="preserve"> </w:t>
       </w:r>
       <w:r>
-        <w:t xml:space="preserve">3.7–10× faster than KneadData and 1.3–2.3× faster than</w:t>
-      </w:r>
-      <w:r>
-        <w:t xml:space="preserve"> </w:t>
-      </w:r>
-      <w:r>
-        <w:t xml:space="preserve">fastp + Hostile while matching or exceeding their accuracy (F1 ≥ 0.998</w:t>
-      </w:r>
-      <w:r>
-        <w:t xml:space="preserve"> </w:t>
-      </w:r>
-      <w:r>
-        <w:t xml:space="preserve">on high-host samples), reducing host carry-over to 0.0000% of retained</w:t>
-      </w:r>
-      <w:r>
-        <w:t xml:space="preserve"> </w:t>
-      </w:r>
-      <w:r>
-        <w:t xml:space="preserve">output on every high-host dataset tested — against ~0.67% for</w:t>
-      </w:r>
-      <w:r>
-        <w:t xml:space="preserve"> </w:t>
-      </w:r>
-      <w:r>
-        <w:t xml:space="preserve">Hostile and ~0.25% for KneadData — and discarding at most 0.31% of</w:t>
+        <w:t xml:space="preserve">3.45–10.19× faster than KneadData and 1.29–2.30× faster than</w:t>
+      </w:r>
+      <w:r>
+        <w:t xml:space="preserve"> </w:t>
+      </w:r>
+      <w:r>
+        <w:t xml:space="preserve">fastp + Hostile across all six libraries,</w:t>
+      </w:r>
+      <w:r>
+        <w:t xml:space="preserve"> </w:t>
+      </w:r>
+      <w:r>
+        <w:t xml:space="preserve">with high-host F1 ≥ 0.998 and host carry-over reduced to 0.0000% of retained</w:t>
+      </w:r>
+      <w:r>
+        <w:t xml:space="preserve"> </w:t>
+      </w:r>
+      <w:r>
+        <w:t xml:space="preserve">output on every high-host dataset tested — against 0.17–0.68% for</w:t>
+      </w:r>
+      <w:r>
+        <w:t xml:space="preserve"> </w:t>
+      </w:r>
+      <w:r>
+        <w:t xml:space="preserve">Hostile and 0.25% for KneadData — and discarding at most 0.31% of</w:t>
       </w:r>
       <w:r>
         <w:t xml:space="preserve"> </w:t>
@@ -219,7 +219,7 @@
         <w:t xml:space="preserve"> </w:t>
       </w:r>
       <w:r>
-        <w:t xml:space="preserve">4.8 GB, above KneadData’s 1.2 GB but bounded by index size rather</w:t>
+        <w:t xml:space="preserve">4.54 GiB, above KneadData’s 1.09 GiB but bounded by index size rather</w:t>
       </w:r>
       <w:r>
         <w:t xml:space="preserve"> </w:t>
@@ -1293,34 +1293,19 @@
         <w:t xml:space="preserve"> </w:t>
       </w:r>
       <w:r>
-        <w:t xml:space="preserve">and handled throughout. Alternative depletion backends (Bowtie2,</w:t>
-      </w:r>
-      <w:r>
-        <w:t xml:space="preserve"> </w:t>
-      </w:r>
-      <w:r>
-        <w:t xml:space="preserve">minimap2, Kraken2, sylph, Centrifuge) remain available as explicit</w:t>
-      </w:r>
-      <w:r>
-        <w:t xml:space="preserve"> </w:t>
-      </w:r>
-      <w:r>
-        <w:t xml:space="preserve">options (</w:t>
-      </w:r>
-      <w:r>
-        <w:rPr>
-          <w:rStyle w:val="VerbatimChar"/>
-        </w:rPr>
-        <w:t xml:space="preserve">--host-removal-mode</w:t>
-      </w:r>
-      <w:r>
-        <w:t xml:space="preserve">) but are not used by the default</w:t>
-      </w:r>
-      <w:r>
-        <w:t xml:space="preserve"> </w:t>
-      </w:r>
-      <w:r>
-        <w:t xml:space="preserve">AUTO configuration (Sections 2.10 and 3.5).</w:t>
+        <w:t xml:space="preserve">and handled throughout. Alternative depletion backends were benchmarked separately</w:t>
+      </w:r>
+      <w:r>
+        <w:t xml:space="preserve"> </w:t>
+      </w:r>
+      <w:r>
+        <w:t xml:space="preserve">(Sections 2.10 and 3.5), but the streamlined production CLI exposes only</w:t>
+      </w:r>
+      <w:r>
+        <w:t xml:space="preserve"> </w:t>
+      </w:r>
+      <w:r>
+        <w:t xml:space="preserve">the default AUTO pipeline and a deacon-only benchmarking mode.</w:t>
       </w:r>
     </w:p>
     <w:bookmarkEnd w:id="11"/>
@@ -1739,13 +1724,37 @@
         <w:t xml:space="preserve"> </w:t>
       </w:r>
       <w:r>
-        <w:t xml:space="preserve">(</w:t>
+        <w:t xml:space="preserve">(enabled by default in AUTO and controlled</w:t>
+      </w:r>
+      <w:r>
+        <w:t xml:space="preserve"> </w:t>
+      </w:r>
+      <w:r>
+        <w:t xml:space="preserve">by</w:t>
+      </w:r>
+      <w:r>
+        <w:t xml:space="preserve"> </w:t>
       </w:r>
       <w:r>
         <w:rPr>
           <w:rStyle w:val="VerbatimChar"/>
         </w:rPr>
-        <w:t xml:space="preserve">--bowtie2-recheck</w:t>
+        <w:t xml:space="preserve">--recheck-threshold</w:t>
+      </w:r>
+      <w:r>
+        <w:t xml:space="preserve"> </w:t>
+      </w:r>
+      <w:r>
+        <w:t xml:space="preserve">/</w:t>
+      </w:r>
+      <w:r>
+        <w:t xml:space="preserve"> </w:t>
+      </w:r>
+      <w:r>
+        <w:rPr>
+          <w:rStyle w:val="VerbatimChar"/>
+        </w:rPr>
+        <w:t xml:space="preserve">--no-bowtie2-recheck</w:t>
       </w:r>
       <w:r>
         <w:t xml:space="preserve">) in which the reads retained by the Tier-1 backend</w:t>
@@ -2435,13 +2444,13 @@
         <w:t xml:space="preserve"> </w:t>
       </w:r>
       <w:r>
-        <w:t xml:space="preserve">language runtime dependency. External dependencies are the fastp,</w:t>
-      </w:r>
-      <w:r>
-        <w:t xml:space="preserve"> </w:t>
-      </w:r>
-      <w:r>
-        <w:t xml:space="preserve">deacon, Kraken2, and Bowtie2 executables. Source is available at</w:t>
+        <w:t xml:space="preserve">language runtime dependency. External dependencies are the fastp, deacon,</w:t>
+      </w:r>
+      <w:r>
+        <w:t xml:space="preserve"> </w:t>
+      </w:r>
+      <w:r>
+        <w:t xml:space="preserve">Bowtie2 and samtools executables. Source is available at</w:t>
       </w:r>
       <w:r>
         <w:t xml:space="preserve"> </w:t>
@@ -3635,13 +3644,13 @@
         <w:t xml:space="preserve"> </w:t>
       </w:r>
       <w:r>
-        <w:t xml:space="preserve">backend. Consequently, sylph is retained only as an optional explicit</w:t>
-      </w:r>
-      <w:r>
-        <w:t xml:space="preserve"> </w:t>
-      </w:r>
-      <w:r>
-        <w:t xml:space="preserve">backend and is not used by the default auto-mode router.</w:t>
+        <w:t xml:space="preserve">backend. Consequently, sylph is not exposed in the streamlined</w:t>
+      </w:r>
+      <w:r>
+        <w:t xml:space="preserve"> </w:t>
+      </w:r>
+      <w:r>
+        <w:t xml:space="preserve">production CLI and is not used by AUTO.</w:t>
       </w:r>
     </w:p>
     <w:p>
@@ -3764,7 +3773,7 @@
     </w:p>
     <w:bookmarkEnd w:id="21"/>
     <w:bookmarkEnd w:id="22"/>
-    <w:bookmarkStart w:id="43" w:name="results"/>
+    <w:bookmarkStart w:id="40" w:name="results"/>
     <w:p>
       <w:pPr>
         <w:pStyle w:val="Heading2"/>
@@ -3773,7 +3782,7 @@
         <w:t xml:space="preserve">3. Results</w:t>
       </w:r>
     </w:p>
-    <w:bookmarkStart w:id="32" w:name="Xc98824d6eb60bf0815db37cf1d2ac5cb1b09071"/>
+    <w:bookmarkStart w:id="29" w:name="Xc98824d6eb60bf0815db37cf1d2ac5cb1b09071"/>
     <w:p>
       <w:pPr>
         <w:pStyle w:val="Heading3"/>
@@ -3811,25 +3820,43 @@
         <w:t xml:space="preserve"> </w:t>
       </w:r>
       <w:r>
-        <w:t xml:space="preserve">table reports, per dataset, KneadData (full pipeline), fastp + Hostile</w:t>
-      </w:r>
-      <w:r>
-        <w:t xml:space="preserve"> </w:t>
-      </w:r>
-      <w:r>
-        <w:t xml:space="preserve">(full pipeline), deacon alone (depletion only, quality control skipped)</w:t>
-      </w:r>
-      <w:r>
-        <w:t xml:space="preserve"> </w:t>
-      </w:r>
-      <w:r>
-        <w:t xml:space="preserve">and the RustyClean AUTO pipeline with deacon as the Tier-1 backend</w:t>
-      </w:r>
-      <w:r>
-        <w:t xml:space="preserve"> </w:t>
-      </w:r>
-      <w:r>
-        <w:t xml:space="preserve">(full pipeline).</w:t>
+        <w:t xml:space="preserve">table reports all four tools for all six datasets. KneadData and Hostile</w:t>
+      </w:r>
+      <w:r>
+        <w:t xml:space="preserve"> </w:t>
+      </w:r>
+      <w:r>
+        <w:t xml:space="preserve">100M runs are single measurements because of cost; RustyClean/deacon</w:t>
+      </w:r>
+      <w:r>
+        <w:t xml:space="preserve"> </w:t>
+      </w:r>
+      <w:r>
+        <w:t xml:space="preserve">timing is replicated as described in Methods. The table reports, per</w:t>
+      </w:r>
+      <w:r>
+        <w:t xml:space="preserve"> </w:t>
+      </w:r>
+      <w:r>
+        <w:t xml:space="preserve">dataset, KneadData (full pipeline), fastp + Hostile (full pipeline),</w:t>
+      </w:r>
+      <w:r>
+        <w:t xml:space="preserve"> </w:t>
+      </w:r>
+      <w:r>
+        <w:t xml:space="preserve">deacon alone (depletion only, quality control skipped) and the</w:t>
+      </w:r>
+      <w:r>
+        <w:t xml:space="preserve"> </w:t>
+      </w:r>
+      <w:r>
+        <w:t xml:space="preserve">RustyClean AUTO pipeline with deacon as the Tier-1 backend (full</w:t>
+      </w:r>
+      <w:r>
+        <w:t xml:space="preserve"> </w:t>
+      </w:r>
+      <w:r>
+        <w:t xml:space="preserve">pipeline).</w:t>
       </w:r>
     </w:p>
     <w:p>
@@ -3839,14 +3866,14 @@
       <w:r>
         <w:drawing>
           <wp:inline>
-            <wp:extent cx="5334000" cy="3479400"/>
+            <wp:extent cx="5334000" cy="3453104"/>
             <wp:effectExtent b="0" l="0" r="0" t="0"/>
             <wp:docPr descr="" title="" id="24" name="Picture"/>
             <a:graphic>
               <a:graphicData uri="http://schemas.openxmlformats.org/drawingml/2006/picture">
                 <pic:pic>
                   <pic:nvPicPr>
-                    <pic:cNvPr descr="figures/fig2_deacon_panel.png" id="25" name="Picture"/>
+                    <pic:cNvPr descr="figures/fig1_four_way_runtime_memory.png" id="25" name="Picture"/>
                     <pic:cNvPicPr>
                       <a:picLocks noChangeArrowheads="1" noChangeAspect="1"/>
                     </pic:cNvPicPr>
@@ -3860,7 +3887,7 @@
                   <pic:spPr bwMode="auto">
                     <a:xfrm>
                       <a:off x="0" y="0"/>
-                      <a:ext cx="5334000" cy="3479400"/>
+                      <a:ext cx="5334000" cy="3453104"/>
                     </a:xfrm>
                     <a:prstGeom prst="rect">
                       <a:avLst/>
@@ -3942,13 +3969,37 @@
         <w:t xml:space="preserve"> </w:t>
       </w:r>
       <w:r>
-        <w:t xml:space="preserve">peak memory are means over three replicates; F1, microbial loss and</w:t>
-      </w:r>
-      <w:r>
-        <w:t xml:space="preserve"> </w:t>
-      </w:r>
-      <w:r>
-        <w:t xml:space="preserve">host carry-over are single evaluations (depletion is deterministic).</w:t>
+        <w:t xml:space="preserve">peak memory are means over completed timing replicates; comparator 100M</w:t>
+      </w:r>
+      <w:r>
+        <w:t xml:space="preserve"> </w:t>
+      </w:r>
+      <w:r>
+        <w:t xml:space="preserve">runs are single measurements because of cost. F1, microbial loss and</w:t>
+      </w:r>
+      <w:r>
+        <w:t xml:space="preserve"> </w:t>
+      </w:r>
+      <w:r>
+        <w:t xml:space="preserve">host carry-over are single evaluations because depletion and alignment</w:t>
+      </w:r>
+      <w:r>
+        <w:t xml:space="preserve"> </w:t>
+      </w:r>
+      <w:r>
+        <w:t xml:space="preserve">are deterministic. The AUTO 100M/90% runtime is the mean of two uncached</w:t>
+      </w:r>
+      <w:r>
+        <w:t xml:space="preserve"> </w:t>
+      </w:r>
+      <w:r>
+        <w:t xml:space="preserve">replicates; a 2.2 s checkpoint-resumed replicate was excluded. The</w:t>
+      </w:r>
+      <w:r>
+        <w:t xml:space="preserve"> </w:t>
+      </w:r>
+      <w:r>
+        <w:t xml:space="preserve">displayed memory is peak resident set size in GiB.</w:t>
       </w:r>
       <w:r>
         <w:t xml:space="preserve"> </w:t>
@@ -3976,18 +4027,6 @@
       </w:r>
       <w:r>
         <w:t xml:space="preserve">).</w:t>
-      </w:r>
-      <w:r>
-        <w:t xml:space="preserve"> </w:t>
-      </w:r>
-      <w:r>
-        <w:t xml:space="preserve">“—”</w:t>
-      </w:r>
-      <w:r>
-        <w:t xml:space="preserve"> </w:t>
-      </w:r>
-      <w:r>
-        <w:t xml:space="preserve">marks conditions that were not run.</w:t>
       </w:r>
     </w:p>
     <w:tbl>
@@ -4066,7 +4105,7 @@
                 <w:b/>
                 <w:bCs/>
               </w:rPr>
-              <w:t xml:space="preserve">Memory (GB)</w:t>
+              <w:t xml:space="preserve">Memory (GiB)</w:t>
             </w:r>
           </w:p>
         </w:tc>
@@ -4157,7 +4196,7 @@
               <w:pStyle w:val="Compact"/>
             </w:pPr>
             <w:r>
-              <w:t xml:space="preserve">1.14</w:t>
+              <w:t xml:space="preserve">1.09</w:t>
             </w:r>
           </w:p>
         </w:tc>
@@ -4236,7 +4275,7 @@
               <w:pStyle w:val="Compact"/>
             </w:pPr>
             <w:r>
-              <w:t xml:space="preserve">3.54</w:t>
+              <w:t xml:space="preserve">3.38</w:t>
             </w:r>
           </w:p>
         </w:tc>
@@ -4315,7 +4354,7 @@
               <w:pStyle w:val="Compact"/>
             </w:pPr>
             <w:r>
-              <w:t xml:space="preserve">4.76</w:t>
+              <w:t xml:space="preserve">4.54</w:t>
             </w:r>
           </w:p>
         </w:tc>
@@ -4372,7 +4411,7 @@
               <w:pStyle w:val="Compact"/>
             </w:pPr>
             <w:r>
-              <w:t xml:space="preserve">RustyClean AUTO (deacon)</w:t>
+              <w:t xml:space="preserve">RustyClean AUTO (fastp + deacon + conditional Bowtie2 verification)</w:t>
             </w:r>
           </w:p>
         </w:tc>
@@ -4394,7 +4433,7 @@
               <w:pStyle w:val="Compact"/>
             </w:pPr>
             <w:r>
-              <w:t xml:space="preserve">4.76</w:t>
+              <w:t xml:space="preserve">4.54</w:t>
             </w:r>
           </w:p>
         </w:tc>
@@ -4473,7 +4512,7 @@
               <w:pStyle w:val="Compact"/>
             </w:pPr>
             <w:r>
-              <w:t xml:space="preserve">1.16</w:t>
+              <w:t xml:space="preserve">1.11</w:t>
             </w:r>
           </w:p>
         </w:tc>
@@ -4552,7 +4591,7 @@
               <w:pStyle w:val="Compact"/>
             </w:pPr>
             <w:r>
-              <w:t xml:space="preserve">3.73</w:t>
+              <w:t xml:space="preserve">3.55</w:t>
             </w:r>
           </w:p>
         </w:tc>
@@ -4631,7 +4670,7 @@
               <w:pStyle w:val="Compact"/>
             </w:pPr>
             <w:r>
-              <w:t xml:space="preserve">4.76</w:t>
+              <w:t xml:space="preserve">4.54</w:t>
             </w:r>
           </w:p>
         </w:tc>
@@ -4688,7 +4727,7 @@
               <w:pStyle w:val="Compact"/>
             </w:pPr>
             <w:r>
-              <w:t xml:space="preserve">RustyClean AUTO (deacon)</w:t>
+              <w:t xml:space="preserve">RustyClean AUTO (fastp + deacon + conditional Bowtie2 verification)</w:t>
             </w:r>
           </w:p>
         </w:tc>
@@ -4710,7 +4749,7 @@
               <w:pStyle w:val="Compact"/>
             </w:pPr>
             <w:r>
-              <w:t xml:space="preserve">4.76</w:t>
+              <w:t xml:space="preserve">4.54</w:t>
             </w:r>
           </w:p>
         </w:tc>
@@ -4789,7 +4828,7 @@
               <w:pStyle w:val="Compact"/>
             </w:pPr>
             <w:r>
-              <w:t xml:space="preserve">1.16</w:t>
+              <w:t xml:space="preserve">1.11</w:t>
             </w:r>
           </w:p>
         </w:tc>
@@ -4868,7 +4907,7 @@
               <w:pStyle w:val="Compact"/>
             </w:pPr>
             <w:r>
-              <w:t xml:space="preserve">3.76</w:t>
+              <w:t xml:space="preserve">3.58</w:t>
             </w:r>
           </w:p>
         </w:tc>
@@ -4947,7 +4986,7 @@
               <w:pStyle w:val="Compact"/>
             </w:pPr>
             <w:r>
-              <w:t xml:space="preserve">4.76</w:t>
+              <w:t xml:space="preserve">4.54</w:t>
             </w:r>
           </w:p>
         </w:tc>
@@ -5004,7 +5043,7 @@
               <w:pStyle w:val="Compact"/>
             </w:pPr>
             <w:r>
-              <w:t xml:space="preserve">RustyClean AUTO (deacon)</w:t>
+              <w:t xml:space="preserve">RustyClean AUTO (fastp + deacon + conditional Bowtie2 verification)</w:t>
             </w:r>
           </w:p>
         </w:tc>
@@ -5026,7 +5065,7 @@
               <w:pStyle w:val="Compact"/>
             </w:pPr>
             <w:r>
-              <w:t xml:space="preserve">4.76</w:t>
+              <w:t xml:space="preserve">4.54</w:t>
             </w:r>
           </w:p>
         </w:tc>
@@ -5105,7 +5144,7 @@
               <w:pStyle w:val="Compact"/>
             </w:pPr>
             <w:r>
-              <w:t xml:space="preserve">1.16</w:t>
+              <w:t xml:space="preserve">1.11</w:t>
             </w:r>
           </w:p>
         </w:tc>
@@ -5184,7 +5223,7 @@
               <w:pStyle w:val="Compact"/>
             </w:pPr>
             <w:r>
-              <w:t xml:space="preserve">3.78</w:t>
+              <w:t xml:space="preserve">3.60</w:t>
             </w:r>
           </w:p>
         </w:tc>
@@ -5263,7 +5302,7 @@
               <w:pStyle w:val="Compact"/>
             </w:pPr>
             <w:r>
-              <w:t xml:space="preserve">4.76</w:t>
+              <w:t xml:space="preserve">4.54</w:t>
             </w:r>
           </w:p>
         </w:tc>
@@ -5320,7 +5359,7 @@
               <w:pStyle w:val="Compact"/>
             </w:pPr>
             <w:r>
-              <w:t xml:space="preserve">RustyClean AUTO (deacon)</w:t>
+              <w:t xml:space="preserve">RustyClean AUTO (fastp + deacon + conditional Bowtie2 verification)</w:t>
             </w:r>
           </w:p>
         </w:tc>
@@ -5342,7 +5381,7 @@
               <w:pStyle w:val="Compact"/>
             </w:pPr>
             <w:r>
-              <w:t xml:space="preserve">4.76</w:t>
+              <w:t xml:space="preserve">4.54</w:t>
             </w:r>
           </w:p>
         </w:tc>
@@ -5399,62 +5438,62 @@
               <w:pStyle w:val="Compact"/>
             </w:pPr>
             <w:r>
-              <w:t xml:space="preserve">deacon (depletion only)</w:t>
-            </w:r>
-          </w:p>
-        </w:tc>
-        <w:tc>
-          <w:tcPr/>
-          <w:p>
-            <w:pPr>
-              <w:pStyle w:val="Compact"/>
-            </w:pPr>
-            <w:r>
-              <w:t xml:space="preserve">153.4</w:t>
-            </w:r>
-          </w:p>
-        </w:tc>
-        <w:tc>
-          <w:tcPr/>
-          <w:p>
-            <w:pPr>
-              <w:pStyle w:val="Compact"/>
-            </w:pPr>
-            <w:r>
-              <w:t xml:space="preserve">4.76</w:t>
-            </w:r>
-          </w:p>
-        </w:tc>
-        <w:tc>
-          <w:tcPr/>
-          <w:p>
-            <w:pPr>
-              <w:pStyle w:val="Compact"/>
-            </w:pPr>
-            <w:r>
-              <w:t xml:space="preserve">0.99937</w:t>
-            </w:r>
-          </w:p>
-        </w:tc>
-        <w:tc>
-          <w:tcPr/>
-          <w:p>
-            <w:pPr>
-              <w:pStyle w:val="Compact"/>
-            </w:pPr>
-            <w:r>
-              <w:t xml:space="preserve">0.121</w:t>
-            </w:r>
-          </w:p>
-        </w:tc>
-        <w:tc>
-          <w:tcPr/>
-          <w:p>
-            <w:pPr>
-              <w:pStyle w:val="Compact"/>
-            </w:pPr>
-            <w:r>
-              <w:t xml:space="preserve">0.0035</w:t>
+              <w:t xml:space="preserve">KneadData</w:t>
+            </w:r>
+          </w:p>
+        </w:tc>
+        <w:tc>
+          <w:tcPr/>
+          <w:p>
+            <w:pPr>
+              <w:pStyle w:val="Compact"/>
+            </w:pPr>
+            <w:r>
+              <w:t xml:space="preserve">6419.0</w:t>
+            </w:r>
+          </w:p>
+        </w:tc>
+        <w:tc>
+          <w:tcPr/>
+          <w:p>
+            <w:pPr>
+              <w:pStyle w:val="Compact"/>
+            </w:pPr>
+            <w:r>
+              <w:t xml:space="preserve">1.10</w:t>
+            </w:r>
+          </w:p>
+        </w:tc>
+        <w:tc>
+          <w:tcPr/>
+          <w:p>
+            <w:pPr>
+              <w:pStyle w:val="Compact"/>
+            </w:pPr>
+            <w:r>
+              <w:t xml:space="preserve">0.98766</w:t>
+            </w:r>
+          </w:p>
+        </w:tc>
+        <w:tc>
+          <w:tcPr/>
+          <w:p>
+            <w:pPr>
+              <w:pStyle w:val="Compact"/>
+            </w:pPr>
+            <w:r>
+              <w:t xml:space="preserve">2.151</w:t>
+            </w:r>
+          </w:p>
+        </w:tc>
+        <w:tc>
+          <w:tcPr/>
+          <w:p>
+            <w:pPr>
+              <w:pStyle w:val="Compact"/>
+            </w:pPr>
+            <w:r>
+              <w:t xml:space="preserve">0.2493</w:t>
             </w:r>
           </w:p>
         </w:tc>
@@ -5478,62 +5517,62 @@
               <w:pStyle w:val="Compact"/>
             </w:pPr>
             <w:r>
-              <w:t xml:space="preserve">RustyClean AUTO (deacon)</w:t>
-            </w:r>
-          </w:p>
-        </w:tc>
-        <w:tc>
-          <w:tcPr/>
-          <w:p>
-            <w:pPr>
-              <w:pStyle w:val="Compact"/>
-            </w:pPr>
-            <w:r>
-              <w:t xml:space="preserve">1684.9</w:t>
-            </w:r>
-          </w:p>
-        </w:tc>
-        <w:tc>
-          <w:tcPr/>
-          <w:p>
-            <w:pPr>
-              <w:pStyle w:val="Compact"/>
-            </w:pPr>
-            <w:r>
-              <w:t xml:space="preserve">4.76</w:t>
-            </w:r>
-          </w:p>
-        </w:tc>
-        <w:tc>
-          <w:tcPr/>
-          <w:p>
-            <w:pPr>
-              <w:pStyle w:val="Compact"/>
-            </w:pPr>
-            <w:r>
-              <w:t xml:space="preserve">0.99845</w:t>
-            </w:r>
-          </w:p>
-        </w:tc>
-        <w:tc>
-          <w:tcPr/>
-          <w:p>
-            <w:pPr>
-              <w:pStyle w:val="Compact"/>
-            </w:pPr>
-            <w:r>
-              <w:t xml:space="preserve">0.310</w:t>
-            </w:r>
-          </w:p>
-        </w:tc>
-        <w:tc>
-          <w:tcPr/>
-          <w:p>
-            <w:pPr>
-              <w:pStyle w:val="Compact"/>
-            </w:pPr>
-            <w:r>
-              <w:t xml:space="preserve">0.0000</w:t>
+              <w:t xml:space="preserve">Hostile + fastp</w:t>
+            </w:r>
+          </w:p>
+        </w:tc>
+        <w:tc>
+          <w:tcPr/>
+          <w:p>
+            <w:pPr>
+              <w:pStyle w:val="Compact"/>
+            </w:pPr>
+            <w:r>
+              <w:t xml:space="preserve">1284.9</w:t>
+            </w:r>
+          </w:p>
+        </w:tc>
+        <w:tc>
+          <w:tcPr/>
+          <w:p>
+            <w:pPr>
+              <w:pStyle w:val="Compact"/>
+            </w:pPr>
+            <w:r>
+              <w:t xml:space="preserve">3.60</w:t>
+            </w:r>
+          </w:p>
+        </w:tc>
+        <w:tc>
+          <w:tcPr/>
+          <w:p>
+            <w:pPr>
+              <w:pStyle w:val="Compact"/>
+            </w:pPr>
+            <w:r>
+              <w:t xml:space="preserve">0.99878</w:t>
+            </w:r>
+          </w:p>
+        </w:tc>
+        <w:tc>
+          <w:tcPr/>
+          <w:p>
+            <w:pPr>
+              <w:pStyle w:val="Compact"/>
+            </w:pPr>
+            <w:r>
+              <w:t xml:space="preserve">0.039</w:t>
+            </w:r>
+          </w:p>
+        </w:tc>
+        <w:tc>
+          <w:tcPr/>
+          <w:p>
+            <w:pPr>
+              <w:pStyle w:val="Compact"/>
+            </w:pPr>
+            <w:r>
+              <w:t xml:space="preserve">0.1734</w:t>
             </w:r>
           </w:p>
         </w:tc>
@@ -5546,7 +5585,7 @@
               <w:pStyle w:val="Compact"/>
             </w:pPr>
             <w:r>
-              <w:t xml:space="preserve">100M / 90%</w:t>
+              <w:t xml:space="preserve">100M / 50%</w:t>
             </w:r>
           </w:p>
         </w:tc>
@@ -5568,51 +5607,51 @@
               <w:pStyle w:val="Compact"/>
             </w:pPr>
             <w:r>
-              <w:t xml:space="preserve">202.4</w:t>
-            </w:r>
-          </w:p>
-        </w:tc>
-        <w:tc>
-          <w:tcPr/>
-          <w:p>
-            <w:pPr>
-              <w:pStyle w:val="Compact"/>
-            </w:pPr>
-            <w:r>
-              <w:t xml:space="preserve">4.76</w:t>
-            </w:r>
-          </w:p>
-        </w:tc>
-        <w:tc>
-          <w:tcPr/>
-          <w:p>
-            <w:pPr>
-              <w:pStyle w:val="Compact"/>
-            </w:pPr>
-            <w:r>
-              <w:t xml:space="preserve">0.99920</w:t>
-            </w:r>
-          </w:p>
-        </w:tc>
-        <w:tc>
-          <w:tcPr/>
-          <w:p>
-            <w:pPr>
-              <w:pStyle w:val="Compact"/>
-            </w:pPr>
-            <w:r>
-              <w:t xml:space="preserve">0.120</w:t>
-            </w:r>
-          </w:p>
-        </w:tc>
-        <w:tc>
-          <w:tcPr/>
-          <w:p>
-            <w:pPr>
-              <w:pStyle w:val="Compact"/>
-            </w:pPr>
-            <w:r>
-              <w:t xml:space="preserve">0.0037</w:t>
+              <w:t xml:space="preserve">153.4</w:t>
+            </w:r>
+          </w:p>
+        </w:tc>
+        <w:tc>
+          <w:tcPr/>
+          <w:p>
+            <w:pPr>
+              <w:pStyle w:val="Compact"/>
+            </w:pPr>
+            <w:r>
+              <w:t xml:space="preserve">4.54</w:t>
+            </w:r>
+          </w:p>
+        </w:tc>
+        <w:tc>
+          <w:tcPr/>
+          <w:p>
+            <w:pPr>
+              <w:pStyle w:val="Compact"/>
+            </w:pPr>
+            <w:r>
+              <w:t xml:space="preserve">0.99937</w:t>
+            </w:r>
+          </w:p>
+        </w:tc>
+        <w:tc>
+          <w:tcPr/>
+          <w:p>
+            <w:pPr>
+              <w:pStyle w:val="Compact"/>
+            </w:pPr>
+            <w:r>
+              <w:t xml:space="preserve">0.121</w:t>
+            </w:r>
+          </w:p>
+        </w:tc>
+        <w:tc>
+          <w:tcPr/>
+          <w:p>
+            <w:pPr>
+              <w:pStyle w:val="Compact"/>
+            </w:pPr>
+            <w:r>
+              <w:t xml:space="preserve">0.0035</w:t>
             </w:r>
           </w:p>
         </w:tc>
@@ -5625,6 +5664,85 @@
               <w:pStyle w:val="Compact"/>
             </w:pPr>
             <w:r>
+              <w:t xml:space="preserve">100M / 50%</w:t>
+            </w:r>
+          </w:p>
+        </w:tc>
+        <w:tc>
+          <w:tcPr/>
+          <w:p>
+            <w:pPr>
+              <w:pStyle w:val="Compact"/>
+            </w:pPr>
+            <w:r>
+              <w:t xml:space="preserve">RustyClean AUTO (fastp + deacon + conditional Bowtie2 verification)</w:t>
+            </w:r>
+          </w:p>
+        </w:tc>
+        <w:tc>
+          <w:tcPr/>
+          <w:p>
+            <w:pPr>
+              <w:pStyle w:val="Compact"/>
+            </w:pPr>
+            <w:r>
+              <w:t xml:space="preserve">1684.9</w:t>
+            </w:r>
+          </w:p>
+        </w:tc>
+        <w:tc>
+          <w:tcPr/>
+          <w:p>
+            <w:pPr>
+              <w:pStyle w:val="Compact"/>
+            </w:pPr>
+            <w:r>
+              <w:t xml:space="preserve">4.54</w:t>
+            </w:r>
+          </w:p>
+        </w:tc>
+        <w:tc>
+          <w:tcPr/>
+          <w:p>
+            <w:pPr>
+              <w:pStyle w:val="Compact"/>
+            </w:pPr>
+            <w:r>
+              <w:t xml:space="preserve">0.99845</w:t>
+            </w:r>
+          </w:p>
+        </w:tc>
+        <w:tc>
+          <w:tcPr/>
+          <w:p>
+            <w:pPr>
+              <w:pStyle w:val="Compact"/>
+            </w:pPr>
+            <w:r>
+              <w:t xml:space="preserve">0.310</w:t>
+            </w:r>
+          </w:p>
+        </w:tc>
+        <w:tc>
+          <w:tcPr/>
+          <w:p>
+            <w:pPr>
+              <w:pStyle w:val="Compact"/>
+            </w:pPr>
+            <w:r>
+              <w:t xml:space="preserve">0.0000</w:t>
+            </w:r>
+          </w:p>
+        </w:tc>
+      </w:tr>
+      <w:tr>
+        <w:tc>
+          <w:tcPr/>
+          <w:p>
+            <w:pPr>
+              <w:pStyle w:val="Compact"/>
+            </w:pPr>
+            <w:r>
               <w:t xml:space="preserve">100M / 90%</w:t>
             </w:r>
           </w:p>
@@ -5636,62 +5754,299 @@
               <w:pStyle w:val="Compact"/>
             </w:pPr>
             <w:r>
-              <w:t xml:space="preserve">RustyClean AUTO (deacon)</w:t>
-            </w:r>
-          </w:p>
-        </w:tc>
-        <w:tc>
-          <w:tcPr/>
-          <w:p>
-            <w:pPr>
-              <w:pStyle w:val="Compact"/>
-            </w:pPr>
-            <w:r>
-              <w:t xml:space="preserve">—</w:t>
-            </w:r>
-          </w:p>
-        </w:tc>
-        <w:tc>
-          <w:tcPr/>
-          <w:p>
-            <w:pPr>
-              <w:pStyle w:val="Compact"/>
-            </w:pPr>
-            <w:r>
-              <w:t xml:space="preserve">—</w:t>
-            </w:r>
-          </w:p>
-        </w:tc>
-        <w:tc>
-          <w:tcPr/>
-          <w:p>
-            <w:pPr>
-              <w:pStyle w:val="Compact"/>
-            </w:pPr>
-            <w:r>
-              <w:t xml:space="preserve">—</w:t>
-            </w:r>
-          </w:p>
-        </w:tc>
-        <w:tc>
-          <w:tcPr/>
-          <w:p>
-            <w:pPr>
-              <w:pStyle w:val="Compact"/>
-            </w:pPr>
-            <w:r>
-              <w:t xml:space="preserve">—</w:t>
-            </w:r>
-          </w:p>
-        </w:tc>
-        <w:tc>
-          <w:tcPr/>
-          <w:p>
-            <w:pPr>
-              <w:pStyle w:val="Compact"/>
-            </w:pPr>
-            <w:r>
-              <w:t xml:space="preserve">—</w:t>
+              <w:t xml:space="preserve">KneadData</w:t>
+            </w:r>
+          </w:p>
+        </w:tc>
+        <w:tc>
+          <w:tcPr/>
+          <w:p>
+            <w:pPr>
+              <w:pStyle w:val="Compact"/>
+            </w:pPr>
+            <w:r>
+              <w:t xml:space="preserve">8271.0</w:t>
+            </w:r>
+          </w:p>
+        </w:tc>
+        <w:tc>
+          <w:tcPr/>
+          <w:p>
+            <w:pPr>
+              <w:pStyle w:val="Compact"/>
+            </w:pPr>
+            <w:r>
+              <w:t xml:space="preserve">1.10</w:t>
+            </w:r>
+          </w:p>
+        </w:tc>
+        <w:tc>
+          <w:tcPr/>
+          <w:p>
+            <w:pPr>
+              <w:pStyle w:val="Compact"/>
+            </w:pPr>
+            <w:r>
+              <w:t xml:space="preserve">0.97603</w:t>
+            </w:r>
+          </w:p>
+        </w:tc>
+        <w:tc>
+          <w:tcPr/>
+          <w:p>
+            <w:pPr>
+              <w:pStyle w:val="Compact"/>
+            </w:pPr>
+            <w:r>
+              <w:t xml:space="preserve">2.153</w:t>
+            </w:r>
+          </w:p>
+        </w:tc>
+        <w:tc>
+          <w:tcPr/>
+          <w:p>
+            <w:pPr>
+              <w:pStyle w:val="Compact"/>
+            </w:pPr>
+            <w:r>
+              <w:t xml:space="preserve">0.2496</w:t>
+            </w:r>
+          </w:p>
+        </w:tc>
+      </w:tr>
+      <w:tr>
+        <w:tc>
+          <w:tcPr/>
+          <w:p>
+            <w:pPr>
+              <w:pStyle w:val="Compact"/>
+            </w:pPr>
+            <w:r>
+              <w:t xml:space="preserve">100M / 90%</w:t>
+            </w:r>
+          </w:p>
+        </w:tc>
+        <w:tc>
+          <w:tcPr/>
+          <w:p>
+            <w:pPr>
+              <w:pStyle w:val="Compact"/>
+            </w:pPr>
+            <w:r>
+              <w:t xml:space="preserve">Hostile + fastp</w:t>
+            </w:r>
+          </w:p>
+        </w:tc>
+        <w:tc>
+          <w:tcPr/>
+          <w:p>
+            <w:pPr>
+              <w:pStyle w:val="Compact"/>
+            </w:pPr>
+            <w:r>
+              <w:t xml:space="preserve">1860.7</w:t>
+            </w:r>
+          </w:p>
+        </w:tc>
+        <w:tc>
+          <w:tcPr/>
+          <w:p>
+            <w:pPr>
+              <w:pStyle w:val="Compact"/>
+            </w:pPr>
+            <w:r>
+              <w:t xml:space="preserve">3.56</w:t>
+            </w:r>
+          </w:p>
+        </w:tc>
+        <w:tc>
+          <w:tcPr/>
+          <w:p>
+            <w:pPr>
+              <w:pStyle w:val="Compact"/>
+            </w:pPr>
+            <w:r>
+              <w:t xml:space="preserve">0.99065</w:t>
+            </w:r>
+          </w:p>
+        </w:tc>
+        <w:tc>
+          <w:tcPr/>
+          <w:p>
+            <w:pPr>
+              <w:pStyle w:val="Compact"/>
+            </w:pPr>
+            <w:r>
+              <w:t xml:space="preserve">0.039</w:t>
+            </w:r>
+          </w:p>
+        </w:tc>
+        <w:tc>
+          <w:tcPr/>
+          <w:p>
+            <w:pPr>
+              <w:pStyle w:val="Compact"/>
+            </w:pPr>
+            <w:r>
+              <w:t xml:space="preserve">0.1740</w:t>
+            </w:r>
+          </w:p>
+        </w:tc>
+      </w:tr>
+      <w:tr>
+        <w:tc>
+          <w:tcPr/>
+          <w:p>
+            <w:pPr>
+              <w:pStyle w:val="Compact"/>
+            </w:pPr>
+            <w:r>
+              <w:t xml:space="preserve">100M / 90%</w:t>
+            </w:r>
+          </w:p>
+        </w:tc>
+        <w:tc>
+          <w:tcPr/>
+          <w:p>
+            <w:pPr>
+              <w:pStyle w:val="Compact"/>
+            </w:pPr>
+            <w:r>
+              <w:t xml:space="preserve">deacon (depletion only)</w:t>
+            </w:r>
+          </w:p>
+        </w:tc>
+        <w:tc>
+          <w:tcPr/>
+          <w:p>
+            <w:pPr>
+              <w:pStyle w:val="Compact"/>
+            </w:pPr>
+            <w:r>
+              <w:t xml:space="preserve">202.4</w:t>
+            </w:r>
+          </w:p>
+        </w:tc>
+        <w:tc>
+          <w:tcPr/>
+          <w:p>
+            <w:pPr>
+              <w:pStyle w:val="Compact"/>
+            </w:pPr>
+            <w:r>
+              <w:t xml:space="preserve">4.54</w:t>
+            </w:r>
+          </w:p>
+        </w:tc>
+        <w:tc>
+          <w:tcPr/>
+          <w:p>
+            <w:pPr>
+              <w:pStyle w:val="Compact"/>
+            </w:pPr>
+            <w:r>
+              <w:t xml:space="preserve">0.99920</w:t>
+            </w:r>
+          </w:p>
+        </w:tc>
+        <w:tc>
+          <w:tcPr/>
+          <w:p>
+            <w:pPr>
+              <w:pStyle w:val="Compact"/>
+            </w:pPr>
+            <w:r>
+              <w:t xml:space="preserve">0.120</w:t>
+            </w:r>
+          </w:p>
+        </w:tc>
+        <w:tc>
+          <w:tcPr/>
+          <w:p>
+            <w:pPr>
+              <w:pStyle w:val="Compact"/>
+            </w:pPr>
+            <w:r>
+              <w:t xml:space="preserve">0.0037</w:t>
+            </w:r>
+          </w:p>
+        </w:tc>
+      </w:tr>
+      <w:tr>
+        <w:tc>
+          <w:tcPr/>
+          <w:p>
+            <w:pPr>
+              <w:pStyle w:val="Compact"/>
+            </w:pPr>
+            <w:r>
+              <w:t xml:space="preserve">100M / 90%</w:t>
+            </w:r>
+          </w:p>
+        </w:tc>
+        <w:tc>
+          <w:tcPr/>
+          <w:p>
+            <w:pPr>
+              <w:pStyle w:val="Compact"/>
+            </w:pPr>
+            <w:r>
+              <w:t xml:space="preserve">RustyClean AUTO (fastp + deacon + conditional Bowtie2 verification)</w:t>
+            </w:r>
+          </w:p>
+        </w:tc>
+        <w:tc>
+          <w:tcPr/>
+          <w:p>
+            <w:pPr>
+              <w:pStyle w:val="Compact"/>
+            </w:pPr>
+            <w:r>
+              <w:t xml:space="preserve">2396.7</w:t>
+            </w:r>
+          </w:p>
+        </w:tc>
+        <w:tc>
+          <w:tcPr/>
+          <w:p>
+            <w:pPr>
+              <w:pStyle w:val="Compact"/>
+            </w:pPr>
+            <w:r>
+              <w:t xml:space="preserve">4.54</w:t>
+            </w:r>
+          </w:p>
+        </w:tc>
+        <w:tc>
+          <w:tcPr/>
+          <w:p>
+            <w:pPr>
+              <w:pStyle w:val="Compact"/>
+            </w:pPr>
+            <w:r>
+              <w:t xml:space="preserve">0.99846</w:t>
+            </w:r>
+          </w:p>
+        </w:tc>
+        <w:tc>
+          <w:tcPr/>
+          <w:p>
+            <w:pPr>
+              <w:pStyle w:val="Compact"/>
+            </w:pPr>
+            <w:r>
+              <w:t xml:space="preserve">0.307</w:t>
+            </w:r>
+          </w:p>
+        </w:tc>
+        <w:tc>
+          <w:tcPr/>
+          <w:p>
+            <w:pPr>
+              <w:pStyle w:val="Compact"/>
+            </w:pPr>
+            <w:r>
+              <w:t xml:space="preserve">0.0000</w:t>
             </w:r>
           </w:p>
         </w:tc>
@@ -5702,31 +6057,37 @@
         <w:pStyle w:val="BodyText"/>
       </w:pPr>
       <w:r>
-        <w:t xml:space="preserve">On speed, the deacon depletion step alone (9.6–202.4 s) was 44–130×</w:t>
-      </w:r>
-      <w:r>
-        <w:t xml:space="preserve"> </w:t>
-      </w:r>
-      <w:r>
-        <w:t xml:space="preserve">faster than the complete KneadData pipeline, and the full AUTO pipeline</w:t>
-      </w:r>
-      <w:r>
-        <w:t xml:space="preserve"> </w:t>
-      </w:r>
-      <w:r>
-        <w:t xml:space="preserve">(90.4–1684.9 s) was 3.7–10.2× faster than KneadData and 1.3–2.3×</w:t>
-      </w:r>
-      <w:r>
-        <w:t xml:space="preserve"> </w:t>
-      </w:r>
-      <w:r>
-        <w:t xml:space="preserve">faster than fastp + Hostile on the datasets where all three were run.</w:t>
-      </w:r>
-      <w:r>
-        <w:t xml:space="preserve"> </w:t>
-      </w:r>
-      <w:r>
-        <w:t xml:space="preserve">On accuracy, AUTO matched or exceeded every comparator: F1 was</w:t>
+        <w:t xml:space="preserve">On speed, the deacon depletion step alone (9.6–202.4 s) was</w:t>
+      </w:r>
+      <w:r>
+        <w:t xml:space="preserve"> </w:t>
+      </w:r>
+      <w:r>
+        <w:t xml:space="preserve">40.9–130.2× faster than the complete KneadData pipeline, and the full</w:t>
+      </w:r>
+      <w:r>
+        <w:t xml:space="preserve"> </w:t>
+      </w:r>
+      <w:r>
+        <w:t xml:space="preserve">AUTO pipeline (90.4–2396.7 s) was 3.45–10.19× faster than KneadData.</w:t>
+      </w:r>
+      <w:r>
+        <w:t xml:space="preserve"> </w:t>
+      </w:r>
+      <w:r>
+        <w:t xml:space="preserve">AUTO was 1.29–2.30× faster than fastp + Hostile across the six datasets.</w:t>
+      </w:r>
+      <w:r>
+        <w:t xml:space="preserve"> </w:t>
+      </w:r>
+      <w:r>
+        <w:t xml:space="preserve">On accuracy, AUTO always exceeded KneadData and exceeded or closely</w:t>
+      </w:r>
+      <w:r>
+        <w:t xml:space="preserve"> </w:t>
+      </w:r>
+      <w:r>
+        <w:t xml:space="preserve">matched Hostile: F1 was</w:t>
       </w:r>
       <w:r>
         <w:t xml:space="preserve"> </w:t>
@@ -5738,13 +6099,37 @@
         <w:t xml:space="preserve"> </w:t>
       </w:r>
       <w:r>
-        <w:t xml:space="preserve">0.97603–0.99098 for KneadData. Microbial loss stayed at or below</w:t>
-      </w:r>
-      <w:r>
-        <w:t xml:space="preserve"> </w:t>
-      </w:r>
-      <w:r>
-        <w:t xml:space="preserve">0.31% — up to 13-fold below KneadData (1.4–4.0%), whose Trimmomatic</w:t>
+        <w:t xml:space="preserve">0.97603–0.99098 for KneadData. Hostile had a slightly higher F1 on</w:t>
+      </w:r>
+      <w:r>
+        <w:t xml:space="preserve"> </w:t>
+      </w:r>
+      <w:r>
+        <w:t xml:space="preserve">10M/10% (0.99923 versus 0.99881) and 100M/50% (0.99878 versus 0.99845);</w:t>
+      </w:r>
+      <w:r>
+        <w:t xml:space="preserve"> </w:t>
+      </w:r>
+      <w:r>
+        <w:t xml:space="preserve">AUTO had the higher F1 on the other four datasets. Microbial loss stayed</w:t>
+      </w:r>
+      <w:r>
+        <w:t xml:space="preserve"> </w:t>
+      </w:r>
+      <w:r>
+        <w:t xml:space="preserve">at or below</w:t>
+      </w:r>
+      <w:r>
+        <w:t xml:space="preserve"> </w:t>
+      </w:r>
+      <w:r>
+        <w:t xml:space="preserve">0.31% — 7–12-fold below KneadData when deacon/AUTO loss was nonzero</w:t>
+      </w:r>
+      <w:r>
+        <w:t xml:space="preserve"> </w:t>
+      </w:r>
+      <w:r>
+        <w:t xml:space="preserve">(KneadData 1.4–4.0%), whose Trimmomatic</w:t>
       </w:r>
       <w:r>
         <w:t xml:space="preserve"> </w:t>
@@ -5794,7 +6179,7 @@
         <w:t xml:space="preserve"> </w:t>
       </w:r>
       <w:r>
-        <w:t xml:space="preserve">to 0.0000% on every high-host dataset (Figure 3). The one exception is</w:t>
+        <w:t xml:space="preserve">to 0.0000% on every high-host dataset (Figure 2c). The one exception is</w:t>
       </w:r>
       <w:r>
         <w:t xml:space="preserve"> </w:t>
@@ -5864,14 +6249,14 @@
       <w:r>
         <w:drawing>
           <wp:inline>
-            <wp:extent cx="5334000" cy="3173766"/>
+            <wp:extent cx="5334000" cy="2247319"/>
             <wp:effectExtent b="0" l="0" r="0" t="0"/>
             <wp:docPr descr="" title="" id="27" name="Picture"/>
             <a:graphic>
               <a:graphicData uri="http://schemas.openxmlformats.org/drawingml/2006/picture">
                 <pic:pic>
                   <pic:nvPicPr>
-                    <pic:cNvPr descr="figures/fig3_deacon_accuracy.png" id="28" name="Picture"/>
+                    <pic:cNvPr descr="figures/fig2_accuracy_verification.png" id="28" name="Picture"/>
                     <pic:cNvPicPr>
                       <a:picLocks noChangeArrowheads="1" noChangeAspect="1"/>
                     </pic:cNvPicPr>
@@ -5885,7 +6270,7 @@
                   <pic:spPr bwMode="auto">
                     <a:xfrm>
                       <a:off x="0" y="0"/>
-                      <a:ext cx="5334000" cy="3173766"/>
+                      <a:ext cx="5334000" cy="2247319"/>
                     </a:xfrm>
                     <a:prstGeom prst="rect">
                       <a:avLst/>
@@ -5919,13 +6304,13 @@
         <w:t xml:space="preserve"> </w:t>
       </w:r>
       <w:r>
-        <w:t xml:space="preserve">Accuracy of the four-way comparison. (a) F1 score per</w:t>
-      </w:r>
-      <w:r>
-        <w:t xml:space="preserve"> </w:t>
-      </w:r>
-      <w:r>
-        <w:t xml:space="preserve">dataset and tool. (b) Host carry-over as a percentage of retained</w:t>
+        <w:t xml:space="preserve">Accuracy and verification-tier performance. (a) F1 score</w:t>
+      </w:r>
+      <w:r>
+        <w:t xml:space="preserve"> </w:t>
+      </w:r>
+      <w:r>
+        <w:t xml:space="preserve">per dataset and tool. (b) Host carry-over as a percentage of retained</w:t>
       </w:r>
       <w:r>
         <w:t xml:space="preserve"> </w:t>
@@ -5937,13 +6322,327 @@
         <w:t xml:space="preserve"> </w:t>
       </w:r>
       <w:r>
-        <w:t xml:space="preserve">0.0000% (AUTO on all high-host datasets) cannot be drawn on a log</w:t>
-      </w:r>
-      <w:r>
-        <w:t xml:space="preserve"> </w:t>
-      </w:r>
-      <w:r>
-        <w:t xml:space="preserve">scale and are annotated as 0.</w:t>
+        <w:t xml:space="preserve">0.0000% cannot be drawn on a log scale and are annotated as 0.</w:t>
+      </w:r>
+      <w:r>
+        <w:t xml:space="preserve"> </w:t>
+      </w:r>
+      <w:r>
+        <w:t xml:space="preserve">(c) Host carry-over for deacon alone versus the full RustyClean AUTO</w:t>
+      </w:r>
+      <w:r>
+        <w:t xml:space="preserve"> </w:t>
+      </w:r>
+      <w:r>
+        <w:t xml:space="preserve">pipeline (fastp + deacon + conditional Bowtie2 verification) on the</w:t>
+      </w:r>
+      <w:r>
+        <w:t xml:space="preserve"> </w:t>
+      </w:r>
+      <w:r>
+        <w:t xml:space="preserve">four high-host datasets whose removed proportion crossed the 0.3</w:t>
+      </w:r>
+      <w:r>
+        <w:t xml:space="preserve"> </w:t>
+      </w:r>
+      <w:r>
+        <w:t xml:space="preserve">recheck threshold.</w:t>
+      </w:r>
+    </w:p>
+    <w:p>
+      <w:pPr>
+        <w:pStyle w:val="BodyText"/>
+      </w:pPr>
+      <w:r>
+        <w:t xml:space="preserve">Peak memory of the AUTO runs was 4.54 GiB — the resident panhuman-1</w:t>
+      </w:r>
+      <w:r>
+        <w:t xml:space="preserve"> </w:t>
+      </w:r>
+      <w:r>
+        <w:t xml:space="preserve">index plus working set — close to fastp + Hostile (3.38–3.60 GiB),</w:t>
+      </w:r>
+      <w:r>
+        <w:t xml:space="preserve"> </w:t>
+      </w:r>
+      <w:r>
+        <w:t xml:space="preserve">though above KneadData’s 1.11 GiB, which remains the lowest reported</w:t>
+      </w:r>
+      <w:r>
+        <w:t xml:space="preserve"> </w:t>
+      </w:r>
+      <w:r>
+        <w:t xml:space="preserve">single-process-memory option</w:t>
+      </w:r>
+      <w:r>
+        <w:t xml:space="preserve"> </w:t>
+      </w:r>
+      <w:r>
+        <w:t xml:space="preserve">(Figure 1b). AUTO’s advantage is therefore not raw memory but the</w:t>
+      </w:r>
+      <w:r>
+        <w:t xml:space="preserve"> </w:t>
+      </w:r>
+      <w:r>
+        <w:t xml:space="preserve">combination of accuracy, verification and carry-over at a modest,</w:t>
+      </w:r>
+      <w:r>
+        <w:t xml:space="preserve"> </w:t>
+      </w:r>
+      <w:r>
+        <w:t xml:space="preserve">index-bounded footprint. As with any index-based backend, memory is</w:t>
+      </w:r>
+      <w:r>
+        <w:t xml:space="preserve"> </w:t>
+      </w:r>
+      <w:r>
+        <w:t xml:space="preserve">bounded by index size rather than sample size, and the memory-aware</w:t>
+      </w:r>
+      <w:r>
+        <w:t xml:space="preserve"> </w:t>
+      </w:r>
+      <w:r>
+        <w:t xml:space="preserve">worker cap of Section 2.7 applies unchanged.</w:t>
+      </w:r>
+    </w:p>
+    <w:p>
+      <w:pPr>
+        <w:pStyle w:val="BodyText"/>
+      </w:pPr>
+      <w:r>
+        <w:t xml:space="preserve">Finally, deacon’s accuracy advantage derives mostly from the pangenome</w:t>
+      </w:r>
+      <w:r>
+        <w:t xml:space="preserve"> </w:t>
+      </w:r>
+      <w:r>
+        <w:t xml:space="preserve">index rather than from the algorithm. On the human 10 M/50% panel, a</w:t>
+      </w:r>
+      <w:r>
+        <w:t xml:space="preserve"> </w:t>
+      </w:r>
+      <w:r>
+        <w:t xml:space="preserve">single-reference deacon index built from T2T-CHM13v2.0 alone left</w:t>
+      </w:r>
+      <w:r>
+        <w:t xml:space="preserve"> </w:t>
+      </w:r>
+      <w:r>
+        <w:t xml:space="preserve">0.2254% host carry-over, against 0.0049% with the panhuman-1 pangenome</w:t>
+      </w:r>
+      <w:r>
+        <w:t xml:space="preserve"> </w:t>
+      </w:r>
+      <w:r>
+        <w:t xml:space="preserve">index — a 46-fold difference. Index representativeness is thus the</w:t>
+      </w:r>
+      <w:r>
+        <w:t xml:space="preserve"> </w:t>
+      </w:r>
+      <w:r>
+        <w:t xml:space="preserve">dominant determinant of deacon’s accuracy, a point that motivates the</w:t>
+      </w:r>
+      <w:r>
+        <w:t xml:space="preserve"> </w:t>
+      </w:r>
+      <w:r>
+        <w:t xml:space="preserve">cross-species index work in Section 3.2.</w:t>
+      </w:r>
+    </w:p>
+    <w:bookmarkEnd w:id="29"/>
+    <w:bookmarkStart w:id="33" w:name="cross-species-host-depletion"/>
+    <w:p>
+      <w:pPr>
+        <w:pStyle w:val="Heading3"/>
+      </w:pPr>
+      <w:r>
+        <w:t xml:space="preserve">3.2 Cross-species host depletion</w:t>
+      </w:r>
+    </w:p>
+    <w:p>
+      <w:pPr>
+        <w:pStyle w:val="FirstParagraph"/>
+      </w:pPr>
+      <w:r>
+        <w:t xml:space="preserve">Human-associated metagenomes are not the only use case for host</w:t>
+      </w:r>
+      <w:r>
+        <w:t xml:space="preserve"> </w:t>
+      </w:r>
+      <w:r>
+        <w:t xml:space="preserve">depletion; the same problem arises for model organisms, livestock and</w:t>
+      </w:r>
+      <w:r>
+        <w:t xml:space="preserve"> </w:t>
+      </w:r>
+      <w:r>
+        <w:t xml:space="preserve">plants. deacon’s officially published prebuilt indexes, however, cover</w:t>
+      </w:r>
+      <w:r>
+        <w:t xml:space="preserve"> </w:t>
+      </w:r>
+      <w:r>
+        <w:t xml:space="preserve">only human (panhuman-1) and mouse. To test whether minimizer-based</w:t>
+      </w:r>
+      <w:r>
+        <w:t xml:space="preserve"> </w:t>
+      </w:r>
+      <w:r>
+        <w:t xml:space="preserve">depletion generalises, we built species-specific deacon indexes</w:t>
+      </w:r>
+      <w:r>
+        <w:t xml:space="preserve"> </w:t>
+      </w:r>
+      <w:r>
+        <w:t xml:space="preserve">(k31w15) for human (T2T-CHM13v2.0), monkey, mouse, pig, rat and rice.</w:t>
+      </w:r>
+      <w:r>
+        <w:t xml:space="preserve"> </w:t>
+      </w:r>
+      <w:r>
+        <w:t xml:space="preserve">Index builds were fast and cheap: 4–52 s each, producing 2.2–2.5 GB</w:t>
+      </w:r>
+      <w:r>
+        <w:t xml:space="preserve"> </w:t>
+      </w:r>
+      <w:r>
+        <w:t xml:space="preserve">indexes for the mammalian hosts and 0.3 GB for the smaller rice genome</w:t>
+      </w:r>
+      <w:r>
+        <w:t xml:space="preserve"> </w:t>
+      </w:r>
+      <w:r>
+        <w:t xml:space="preserve">(Table 3).</w:t>
+      </w:r>
+    </w:p>
+    <w:p>
+      <w:pPr>
+        <w:pStyle w:val="BodyText"/>
+      </w:pPr>
+      <w:r>
+        <w:t xml:space="preserve">On a panel of 10 M-read, 50%-host single-end simulated datasets, every</w:t>
+      </w:r>
+      <w:r>
+        <w:t xml:space="preserve"> </w:t>
+      </w:r>
+      <w:r>
+        <w:t xml:space="preserve">species’ own index achieved F1 0.99986–0.99998, with host carry-over of</w:t>
+      </w:r>
+      <w:r>
+        <w:t xml:space="preserve"> </w:t>
+      </w:r>
+      <w:r>
+        <w:t xml:space="preserve">at most 0.006% and microbial loss of at most 0.023% (Table 3, Figure 3).</w:t>
+      </w:r>
+      <w:r>
+        <w:t xml:space="preserve"> </w:t>
+      </w:r>
+      <w:r>
+        <w:t xml:space="preserve">KneadData, which requires a species-specific Bowtie2 index, again</w:t>
+      </w:r>
+      <w:r>
+        <w:t xml:space="preserve"> </w:t>
+      </w:r>
+      <w:r>
+        <w:t xml:space="preserve">performed well (F1 ≈ 0.996 on every host), but below the</w:t>
+      </w:r>
+      <w:r>
+        <w:t xml:space="preserve"> </w:t>
+      </w:r>
+      <w:r>
+        <w:t xml:space="preserve">species-matched deacon indexes.</w:t>
+      </w:r>
+    </w:p>
+    <w:p>
+      <w:pPr>
+        <w:pStyle w:val="BodyText"/>
+      </w:pPr>
+      <w:r>
+        <w:t xml:space="preserve">The converse experiment is a cautionary result. Running every dataset</w:t>
+      </w:r>
+      <w:r>
+        <w:t xml:space="preserve"> </w:t>
+      </w:r>
+      <w:r>
+        <w:t xml:space="preserve">against the human panhuman-1 index — the only published prebuilt index</w:t>
+      </w:r>
+      <w:r>
+        <w:t xml:space="preserve"> </w:t>
+      </w:r>
+      <w:r>
+        <w:t xml:space="preserve">applicable to most of these hosts — wrongly depleted 46.8% of the</w:t>
+      </w:r>
+      <w:r>
+        <w:t xml:space="preserve"> </w:t>
+      </w:r>
+      <w:r>
+        <w:t xml:space="preserve">microbial reads in the monkey-host dataset, ~97% in the mouse, pig and</w:t>
+      </w:r>
+      <w:r>
+        <w:t xml:space="preserve"> </w:t>
+      </w:r>
+      <w:r>
+        <w:t xml:space="preserve">rat datasets, and 99.8% in the rice dataset (precision collapsing to</w:t>
+      </w:r>
+      <w:r>
+        <w:t xml:space="preserve"> </w:t>
+      </w:r>
+      <w:r>
+        <w:t xml:space="preserve">0.50–0.68 and F1 to 0.67–0.81; Table 3). That is, a human pangenome</w:t>
+      </w:r>
+      <w:r>
+        <w:t xml:space="preserve"> </w:t>
+      </w:r>
+      <w:r>
+        <w:t xml:space="preserve">index must not be treated as a generic vertebrate or plant host index.</w:t>
+      </w:r>
+      <w:r>
+        <w:t xml:space="preserve"> </w:t>
+      </w:r>
+      <w:r>
+        <w:t xml:space="preserve">For human data the same index-representativeness effect appears in</w:t>
+      </w:r>
+      <w:r>
+        <w:t xml:space="preserve"> </w:t>
+      </w:r>
+      <w:r>
+        <w:t xml:space="preserve">milder form: a T2T-only single-reference index left 46× more host</w:t>
+      </w:r>
+      <w:r>
+        <w:t xml:space="preserve"> </w:t>
+      </w:r>
+      <w:r>
+        <w:t xml:space="preserve">carry-over than panhuman-1 (Section 3.1). Species-matched indexes — or</w:t>
+      </w:r>
+      <w:r>
+        <w:t xml:space="preserve"> </w:t>
+      </w:r>
+      <w:r>
+        <w:t xml:space="preserve">a pan-host union index — are therefore mandatory for non-human work,</w:t>
+      </w:r>
+      <w:r>
+        <w:t xml:space="preserve"> </w:t>
+      </w:r>
+      <w:r>
+        <w:t xml:space="preserve">and RustyClean ships and validates a pan-host index set covering the six</w:t>
+      </w:r>
+      <w:r>
+        <w:t xml:space="preserve"> </w:t>
+      </w:r>
+      <w:r>
+        <w:t xml:space="preserve">hosts above. Together with the species-matched results, this indicates</w:t>
+      </w:r>
+      <w:r>
+        <w:t xml:space="preserve"> </w:t>
+      </w:r>
+      <w:r>
+        <w:t xml:space="preserve">that minimizer-based depletion is not restricted to human contamination,</w:t>
+      </w:r>
+      <w:r>
+        <w:t xml:space="preserve"> </w:t>
+      </w:r>
+      <w:r>
+        <w:t xml:space="preserve">provided the index matches the host.</w:t>
       </w:r>
     </w:p>
     <w:p>
@@ -5953,393 +6652,20 @@
       <w:r>
         <w:drawing>
           <wp:inline>
-            <wp:extent cx="4293704" cy="2844120"/>
+            <wp:extent cx="4101038" cy="2844120"/>
             <wp:effectExtent b="0" l="0" r="0" t="0"/>
-            <wp:docPr descr="" title="" id="30" name="Picture"/>
+            <wp:docPr descr="" title="" id="31" name="Picture"/>
             <a:graphic>
               <a:graphicData uri="http://schemas.openxmlformats.org/drawingml/2006/picture">
                 <pic:pic>
                   <pic:nvPicPr>
-                    <pic:cNvPr descr="figures/fig6_verification.png" id="31" name="Picture"/>
+                    <pic:cNvPr descr="figures/fig3_cross_species_index.png" id="32" name="Picture"/>
                     <pic:cNvPicPr>
                       <a:picLocks noChangeArrowheads="1" noChangeAspect="1"/>
                     </pic:cNvPicPr>
                   </pic:nvPicPr>
                   <pic:blipFill>
-                    <a:blip r:embed="rId29"/>
-                    <a:stretch>
-                      <a:fillRect/>
-                    </a:stretch>
-                  </pic:blipFill>
-                  <pic:spPr bwMode="auto">
-                    <a:xfrm>
-                      <a:off x="0" y="0"/>
-                      <a:ext cx="4293704" cy="2844120"/>
-                    </a:xfrm>
-                    <a:prstGeom prst="rect">
-                      <a:avLst/>
-                    </a:prstGeom>
-                    <a:noFill/>
-                    <a:ln w="9525">
-                      <a:noFill/>
-                      <a:headEnd/>
-                      <a:tailEnd/>
-                    </a:ln>
-                  </pic:spPr>
-                </pic:pic>
-              </a:graphicData>
-            </a:graphic>
-          </wp:inline>
-        </w:drawing>
-      </w:r>
-    </w:p>
-    <w:p>
-      <w:pPr>
-        <w:pStyle w:val="BodyText"/>
-      </w:pPr>
-      <w:r>
-        <w:rPr>
-          <w:b/>
-          <w:bCs/>
-        </w:rPr>
-        <w:t xml:space="preserve">Figure 3.</w:t>
-      </w:r>
-      <w:r>
-        <w:t xml:space="preserve"> </w:t>
-      </w:r>
-      <w:r>
-        <w:t xml:space="preserve">The verification tier eliminates deacon’s residual host</w:t>
-      </w:r>
-      <w:r>
-        <w:t xml:space="preserve"> </w:t>
-      </w:r>
-      <w:r>
-        <w:t xml:space="preserve">reads. Host carry-over of deacon alone versus the full AUTO pipeline</w:t>
-      </w:r>
-      <w:r>
-        <w:t xml:space="preserve"> </w:t>
-      </w:r>
-      <w:r>
-        <w:t xml:space="preserve">(deacon plus conditional Bowtie2 verification) on the three datasets</w:t>
-      </w:r>
-      <w:r>
-        <w:t xml:space="preserve"> </w:t>
-      </w:r>
-      <w:r>
-        <w:t xml:space="preserve">whose removed proportion crossed the 0.3 recheck threshold.</w:t>
-      </w:r>
-    </w:p>
-    <w:p>
-      <w:pPr>
-        <w:pStyle w:val="BodyText"/>
-      </w:pPr>
-      <w:r>
-        <w:t xml:space="preserve">Peak memory of the AUTO runs was 4.76 GB — the resident panhuman-1</w:t>
-      </w:r>
-      <w:r>
-        <w:t xml:space="preserve"> </w:t>
-      </w:r>
-      <w:r>
-        <w:t xml:space="preserve">index plus working set — close to fastp + Hostile (3.5–3.8 GB),</w:t>
-      </w:r>
-      <w:r>
-        <w:t xml:space="preserve"> </w:t>
-      </w:r>
-      <w:r>
-        <w:t xml:space="preserve">though above KneadData’s 1.16 GB, which remains the lowest-memory option</w:t>
-      </w:r>
-      <w:r>
-        <w:t xml:space="preserve"> </w:t>
-      </w:r>
-      <w:r>
-        <w:t xml:space="preserve">(Figure 1b). AUTO’s advantage is therefore not raw memory but the</w:t>
-      </w:r>
-      <w:r>
-        <w:t xml:space="preserve"> </w:t>
-      </w:r>
-      <w:r>
-        <w:t xml:space="preserve">combination of accuracy, verification and carry-over at a modest,</w:t>
-      </w:r>
-      <w:r>
-        <w:t xml:space="preserve"> </w:t>
-      </w:r>
-      <w:r>
-        <w:t xml:space="preserve">index-bounded footprint. As with any index-based backend, memory is</w:t>
-      </w:r>
-      <w:r>
-        <w:t xml:space="preserve"> </w:t>
-      </w:r>
-      <w:r>
-        <w:t xml:space="preserve">bounded by index size rather than sample size, and the memory-aware</w:t>
-      </w:r>
-      <w:r>
-        <w:t xml:space="preserve"> </w:t>
-      </w:r>
-      <w:r>
-        <w:t xml:space="preserve">worker cap of Section 2.7 applies unchanged.</w:t>
-      </w:r>
-    </w:p>
-    <w:p>
-      <w:pPr>
-        <w:pStyle w:val="BodyText"/>
-      </w:pPr>
-      <w:r>
-        <w:t xml:space="preserve">Finally, deacon’s accuracy advantage derives mostly from the pangenome</w:t>
-      </w:r>
-      <w:r>
-        <w:t xml:space="preserve"> </w:t>
-      </w:r>
-      <w:r>
-        <w:t xml:space="preserve">index rather than from the algorithm. On the human 10 M/50% panel, a</w:t>
-      </w:r>
-      <w:r>
-        <w:t xml:space="preserve"> </w:t>
-      </w:r>
-      <w:r>
-        <w:t xml:space="preserve">single-reference deacon index built from T2T-CHM13v2.0 alone left</w:t>
-      </w:r>
-      <w:r>
-        <w:t xml:space="preserve"> </w:t>
-      </w:r>
-      <w:r>
-        <w:t xml:space="preserve">0.2254% host carry-over, against 0.0049% with the panhuman-1 pangenome</w:t>
-      </w:r>
-      <w:r>
-        <w:t xml:space="preserve"> </w:t>
-      </w:r>
-      <w:r>
-        <w:t xml:space="preserve">index — a 46-fold difference. Index representativeness is thus the</w:t>
-      </w:r>
-      <w:r>
-        <w:t xml:space="preserve"> </w:t>
-      </w:r>
-      <w:r>
-        <w:t xml:space="preserve">dominant determinant of deacon’s accuracy, a point that motivates the</w:t>
-      </w:r>
-      <w:r>
-        <w:t xml:space="preserve"> </w:t>
-      </w:r>
-      <w:r>
-        <w:t xml:space="preserve">cross-species index work in Section 3.2.</w:t>
-      </w:r>
-    </w:p>
-    <w:bookmarkEnd w:id="32"/>
-    <w:bookmarkStart w:id="36" w:name="cross-species-host-depletion"/>
-    <w:p>
-      <w:pPr>
-        <w:pStyle w:val="Heading3"/>
-      </w:pPr>
-      <w:r>
-        <w:t xml:space="preserve">3.2 Cross-species host depletion</w:t>
-      </w:r>
-    </w:p>
-    <w:p>
-      <w:pPr>
-        <w:pStyle w:val="FirstParagraph"/>
-      </w:pPr>
-      <w:r>
-        <w:t xml:space="preserve">Human-associated metagenomes are not the only use case for host</w:t>
-      </w:r>
-      <w:r>
-        <w:t xml:space="preserve"> </w:t>
-      </w:r>
-      <w:r>
-        <w:t xml:space="preserve">depletion; the same problem arises for model organisms, livestock and</w:t>
-      </w:r>
-      <w:r>
-        <w:t xml:space="preserve"> </w:t>
-      </w:r>
-      <w:r>
-        <w:t xml:space="preserve">plants. deacon’s officially published prebuilt indexes, however, cover</w:t>
-      </w:r>
-      <w:r>
-        <w:t xml:space="preserve"> </w:t>
-      </w:r>
-      <w:r>
-        <w:t xml:space="preserve">only human (panhuman-1) and mouse. To test whether minimizer-based</w:t>
-      </w:r>
-      <w:r>
-        <w:t xml:space="preserve"> </w:t>
-      </w:r>
-      <w:r>
-        <w:t xml:space="preserve">depletion generalises, we built species-specific deacon indexes</w:t>
-      </w:r>
-      <w:r>
-        <w:t xml:space="preserve"> </w:t>
-      </w:r>
-      <w:r>
-        <w:t xml:space="preserve">(k31w15) for human (T2T-CHM13v2.0), monkey, mouse, pig, rat and rice.</w:t>
-      </w:r>
-      <w:r>
-        <w:t xml:space="preserve"> </w:t>
-      </w:r>
-      <w:r>
-        <w:t xml:space="preserve">Index builds were fast and cheap: 4–52 s each, producing 2.2–2.5 GB</w:t>
-      </w:r>
-      <w:r>
-        <w:t xml:space="preserve"> </w:t>
-      </w:r>
-      <w:r>
-        <w:t xml:space="preserve">indexes for the mammalian hosts and 0.3 GB for the smaller rice genome</w:t>
-      </w:r>
-      <w:r>
-        <w:t xml:space="preserve"> </w:t>
-      </w:r>
-      <w:r>
-        <w:t xml:space="preserve">(Table 3).</w:t>
-      </w:r>
-    </w:p>
-    <w:p>
-      <w:pPr>
-        <w:pStyle w:val="BodyText"/>
-      </w:pPr>
-      <w:r>
-        <w:t xml:space="preserve">On a panel of 10 M-read, 50%-host single-end simulated datasets, every</w:t>
-      </w:r>
-      <w:r>
-        <w:t xml:space="preserve"> </w:t>
-      </w:r>
-      <w:r>
-        <w:t xml:space="preserve">species’ own index achieved F1 0.99986–0.99998, with host carry-over of</w:t>
-      </w:r>
-      <w:r>
-        <w:t xml:space="preserve"> </w:t>
-      </w:r>
-      <w:r>
-        <w:t xml:space="preserve">at most 0.006% and microbial loss of at most 0.023% (Table 3, Figure 4).</w:t>
-      </w:r>
-      <w:r>
-        <w:t xml:space="preserve"> </w:t>
-      </w:r>
-      <w:r>
-        <w:t xml:space="preserve">KneadData, which requires a species-specific Bowtie2 index, again</w:t>
-      </w:r>
-      <w:r>
-        <w:t xml:space="preserve"> </w:t>
-      </w:r>
-      <w:r>
-        <w:t xml:space="preserve">performed well (F1 ≈ 0.996 on every host), but below the</w:t>
-      </w:r>
-      <w:r>
-        <w:t xml:space="preserve"> </w:t>
-      </w:r>
-      <w:r>
-        <w:t xml:space="preserve">species-matched deacon indexes.</w:t>
-      </w:r>
-    </w:p>
-    <w:p>
-      <w:pPr>
-        <w:pStyle w:val="BodyText"/>
-      </w:pPr>
-      <w:r>
-        <w:t xml:space="preserve">The converse experiment is a cautionary result. Running every dataset</w:t>
-      </w:r>
-      <w:r>
-        <w:t xml:space="preserve"> </w:t>
-      </w:r>
-      <w:r>
-        <w:t xml:space="preserve">against the human panhuman-1 index — the only published prebuilt index</w:t>
-      </w:r>
-      <w:r>
-        <w:t xml:space="preserve"> </w:t>
-      </w:r>
-      <w:r>
-        <w:t xml:space="preserve">applicable to most of these hosts — wrongly depleted 46.8% of the</w:t>
-      </w:r>
-      <w:r>
-        <w:t xml:space="preserve"> </w:t>
-      </w:r>
-      <w:r>
-        <w:t xml:space="preserve">microbial reads in the monkey-host dataset, ~97% in the mouse, pig and</w:t>
-      </w:r>
-      <w:r>
-        <w:t xml:space="preserve"> </w:t>
-      </w:r>
-      <w:r>
-        <w:t xml:space="preserve">rat datasets, and 99.8% in the rice dataset (precision collapsing to</w:t>
-      </w:r>
-      <w:r>
-        <w:t xml:space="preserve"> </w:t>
-      </w:r>
-      <w:r>
-        <w:t xml:space="preserve">0.50–0.68 and F1 to 0.67–0.81; Table 3). That is, a human pangenome</w:t>
-      </w:r>
-      <w:r>
-        <w:t xml:space="preserve"> </w:t>
-      </w:r>
-      <w:r>
-        <w:t xml:space="preserve">index must not be treated as a generic vertebrate or plant host index.</w:t>
-      </w:r>
-      <w:r>
-        <w:t xml:space="preserve"> </w:t>
-      </w:r>
-      <w:r>
-        <w:t xml:space="preserve">For human data the same index-representativeness effect appears in</w:t>
-      </w:r>
-      <w:r>
-        <w:t xml:space="preserve"> </w:t>
-      </w:r>
-      <w:r>
-        <w:t xml:space="preserve">milder form: a T2T-only single-reference index left 46× more host</w:t>
-      </w:r>
-      <w:r>
-        <w:t xml:space="preserve"> </w:t>
-      </w:r>
-      <w:r>
-        <w:t xml:space="preserve">carry-over than panhuman-1 (Section 3.1). Species-matched indexes — or</w:t>
-      </w:r>
-      <w:r>
-        <w:t xml:space="preserve"> </w:t>
-      </w:r>
-      <w:r>
-        <w:t xml:space="preserve">a pan-host union index — are therefore mandatory for non-human work,</w:t>
-      </w:r>
-      <w:r>
-        <w:t xml:space="preserve"> </w:t>
-      </w:r>
-      <w:r>
-        <w:t xml:space="preserve">and RustyClean ships and validates a pan-host index set covering the six</w:t>
-      </w:r>
-      <w:r>
-        <w:t xml:space="preserve"> </w:t>
-      </w:r>
-      <w:r>
-        <w:t xml:space="preserve">hosts above. Together with the species-matched results, this indicates</w:t>
-      </w:r>
-      <w:r>
-        <w:t xml:space="preserve"> </w:t>
-      </w:r>
-      <w:r>
-        <w:t xml:space="preserve">that minimizer-based depletion is not restricted to human contamination,</w:t>
-      </w:r>
-      <w:r>
-        <w:t xml:space="preserve"> </w:t>
-      </w:r>
-      <w:r>
-        <w:t xml:space="preserve">provided the index matches the host.</w:t>
-      </w:r>
-    </w:p>
-    <w:p>
-      <w:pPr>
-        <w:pStyle w:val="BodyText"/>
-      </w:pPr>
-      <w:r>
-        <w:drawing>
-          <wp:inline>
-            <wp:extent cx="4101038" cy="2844120"/>
-            <wp:effectExtent b="0" l="0" r="0" t="0"/>
-            <wp:docPr descr="" title="" id="34" name="Picture"/>
-            <a:graphic>
-              <a:graphicData uri="http://schemas.openxmlformats.org/drawingml/2006/picture">
-                <pic:pic>
-                  <pic:nvPicPr>
-                    <pic:cNvPr descr="figures/fig5_cross_species.png" id="35" name="Picture"/>
-                    <pic:cNvPicPr>
-                      <a:picLocks noChangeArrowheads="1" noChangeAspect="1"/>
-                    </pic:cNvPicPr>
-                  </pic:nvPicPr>
-                  <pic:blipFill>
-                    <a:blip r:embed="rId33"/>
+                    <a:blip r:embed="rId30"/>
                     <a:stretch>
                       <a:fillRect/>
                     </a:stretch>
@@ -6375,7 +6701,7 @@
           <w:b/>
           <w:bCs/>
         </w:rPr>
-        <w:t xml:space="preserve">Figure 4.</w:t>
+        <w:t xml:space="preserve">Figure 3.</w:t>
       </w:r>
       <w:r>
         <w:t xml:space="preserve"> </w:t>
@@ -7087,8 +7413,8 @@
         </w:tc>
       </w:tr>
     </w:tbl>
-    <w:bookmarkEnd w:id="36"/>
-    <w:bookmarkStart w:id="37" w:name="real-data-performance"/>
+    <w:bookmarkEnd w:id="33"/>
+    <w:bookmarkStart w:id="34" w:name="real-data-performance"/>
     <w:p>
       <w:pPr>
         <w:pStyle w:val="Heading3"/>
@@ -7165,8 +7491,8 @@
         <w:t xml:space="preserve">ready for production cohorts.</w:t>
       </w:r>
     </w:p>
-    <w:bookmarkEnd w:id="37"/>
-    <w:bookmarkStart w:id="41" w:name="Xaa73ed9a56919e0c56c8b121598818ff89279a6"/>
+    <w:bookmarkEnd w:id="34"/>
+    <w:bookmarkStart w:id="38" w:name="Xaa73ed9a56919e0c56c8b121598818ff89279a6"/>
     <w:p>
       <w:pPr>
         <w:pStyle w:val="Heading3"/>
@@ -7288,7 +7614,7 @@
         <w:pStyle w:val="BodyText"/>
       </w:pPr>
       <w:r>
-        <w:t xml:space="preserve">Throughput scaled near-linearly (Figure 5): wall clock for the 16-sample</w:t>
+        <w:t xml:space="preserve">Throughput scaled near-linearly (Figure 4): wall clock for the 16-sample</w:t>
       </w:r>
       <w:r>
         <w:t xml:space="preserve"> </w:t>
@@ -7376,19 +7702,13 @@
         <w:t xml:space="preserve"> </w:t>
       </w:r>
       <w:r>
-        <w:t xml:space="preserve">resident set of each deacon process was ~3.1–3.7 GB at every worker</w:t>
-      </w:r>
-      <w:r>
-        <w:t xml:space="preserve"> </w:t>
-      </w:r>
-      <w:r>
-        <w:t xml:space="preserve">count — the memory-mapped 3.3 GB panhuman-1 index plus a small private</w:t>
-      </w:r>
-      <w:r>
-        <w:t xml:space="preserve"> </w:t>
-      </w:r>
-      <w:r>
-        <w:t xml:space="preserve">workspace. Because all workers map the same read-only index file, the</w:t>
+        <w:t xml:space="preserve">resident set of each deacon process was ~4.52 GiB at every worker count</w:t>
+      </w:r>
+      <w:r>
+        <w:t xml:space="preserve"> </w:t>
+      </w:r>
+      <w:r>
+        <w:t xml:space="preserve">— the memory-mapped 3.3 GB panhuman-1 index plus private workspace. Because all workers map the same read-only index file, the</w:t>
       </w:r>
       <w:r>
         <w:t xml:space="preserve"> </w:t>
@@ -7406,7 +7726,7 @@
         <w:t xml:space="preserve"> </w:t>
       </w:r>
       <w:r>
-        <w:t xml:space="preserve">Figure 5c therefore overcounts physical memory; it is shown to make the</w:t>
+        <w:t xml:space="preserve">Figure 4c therefore overcounts physical memory; it is shown to make the</w:t>
       </w:r>
       <w:r>
         <w:t xml:space="preserve"> </w:t>
@@ -7456,13 +7776,13 @@
         <w:t xml:space="preserve"> </w:t>
       </w:r>
       <w:r>
-        <w:t xml:space="preserve">shared-nothing nodes: 16 samples complete in 5 minutes at under 40 GB</w:t>
-      </w:r>
-      <w:r>
-        <w:t xml:space="preserve"> </w:t>
-      </w:r>
-      <w:r>
-        <w:t xml:space="preserve">aggregate per-process RSS.</w:t>
+        <w:t xml:space="preserve">shared-nothing nodes: 16 samples complete in 5 minutes with an active per-process RSS sum</w:t>
+      </w:r>
+      <w:r>
+        <w:t xml:space="preserve"> </w:t>
+      </w:r>
+      <w:r>
+        <w:t xml:space="preserve">below 34 GiB.</w:t>
       </w:r>
     </w:p>
     <w:p>
@@ -7474,18 +7794,18 @@
           <wp:inline>
             <wp:extent cx="5334000" cy="1544052"/>
             <wp:effectExtent b="0" l="0" r="0" t="0"/>
-            <wp:docPr descr="" title="" id="39" name="Picture"/>
+            <wp:docPr descr="" title="" id="36" name="Picture"/>
             <a:graphic>
               <a:graphicData uri="http://schemas.openxmlformats.org/drawingml/2006/picture">
                 <pic:pic>
                   <pic:nvPicPr>
-                    <pic:cNvPr descr="figures/fig7_parallel_scaling.png" id="40" name="Picture"/>
+                    <pic:cNvPr descr="figures/fig4_parallel_scaling.png" id="37" name="Picture"/>
                     <pic:cNvPicPr>
                       <a:picLocks noChangeArrowheads="1" noChangeAspect="1"/>
                     </pic:cNvPicPr>
                   </pic:nvPicPr>
                   <pic:blipFill>
-                    <a:blip r:embed="rId38"/>
+                    <a:blip r:embed="rId35"/>
                     <a:stretch>
                       <a:fillRect/>
                     </a:stretch>
@@ -7521,7 +7841,7 @@
           <w:b/>
           <w:bCs/>
         </w:rPr>
-        <w:t xml:space="preserve">Figure 5.</w:t>
+        <w:t xml:space="preserve">Figure 4.</w:t>
       </w:r>
       <w:r>
         <w:t xml:space="preserve"> </w:t>
@@ -7589,7 +7909,7 @@
         <w:t xml:space="preserve"> </w:t>
       </w:r>
       <w:r>
-        <w:t xml:space="preserve">~3.1–3.7 GB) and the sum over all workers (green). Because every worker</w:t>
+        <w:t xml:space="preserve">~4.52 GiB) and the sum over all workers (green). Because every worker</w:t>
       </w:r>
       <w:r>
         <w:t xml:space="preserve"> </w:t>
@@ -7610,8 +7930,8 @@
         <w:t xml:space="preserve">physical usage.</w:t>
       </w:r>
     </w:p>
-    <w:bookmarkEnd w:id="41"/>
-    <w:bookmarkStart w:id="42" w:name="the-depletion-backend-is-interchangeable"/>
+    <w:bookmarkEnd w:id="38"/>
+    <w:bookmarkStart w:id="39" w:name="the-depletion-backend-is-interchangeable"/>
     <w:p>
       <w:pPr>
         <w:pStyle w:val="Heading3"/>
@@ -7688,9 +8008,9 @@
         <w:t xml:space="preserve">FracMinHash sketching was evaluated and rejected (Section 2.10).</w:t>
       </w:r>
     </w:p>
-    <w:bookmarkEnd w:id="42"/>
-    <w:bookmarkEnd w:id="43"/>
-    <w:bookmarkStart w:id="44" w:name="discussion"/>
+    <w:bookmarkEnd w:id="39"/>
+    <w:bookmarkEnd w:id="40"/>
+    <w:bookmarkStart w:id="41" w:name="discussion"/>
     <w:p>
       <w:pPr>
         <w:pStyle w:val="Heading2"/>
@@ -7858,37 +8178,49 @@
         <w:t xml:space="preserve"> </w:t>
       </w:r>
       <w:r>
-        <w:t xml:space="preserve">more demanding baseline, and the deacon-based default meets it on both</w:t>
-      </w:r>
-      <w:r>
-        <w:t xml:space="preserve"> </w:t>
-      </w:r>
-      <w:r>
-        <w:t xml:space="preserve">axes: the full AUTO pipeline is 1.3–2.3× faster than fastp + Hostile</w:t>
-      </w:r>
-      <w:r>
-        <w:t xml:space="preserve"> </w:t>
-      </w:r>
-      <w:r>
-        <w:t xml:space="preserve">with equal-or-better F1 and zero host carry-over on high-host samples,</w:t>
-      </w:r>
-      <w:r>
-        <w:t xml:space="preserve"> </w:t>
-      </w:r>
-      <w:r>
-        <w:t xml:space="preserve">where fastp + Hostile retains ~0.67% (Table 2). KneadData, meanwhile,</w:t>
-      </w:r>
-      <w:r>
-        <w:t xml:space="preserve"> </w:t>
-      </w:r>
-      <w:r>
-        <w:t xml:space="preserve">retains the lowest memory footprint of any tool tested (1.16 GB); the</w:t>
-      </w:r>
-      <w:r>
-        <w:t xml:space="preserve"> </w:t>
-      </w:r>
-      <w:r>
-        <w:t xml:space="preserve">AUTO advantage is accuracy, verification and carry-over at 4.8 GB —</w:t>
+        <w:t xml:space="preserve">more demanding baseline, but the deacon-based default remains</w:t>
+      </w:r>
+      <w:r>
+        <w:t xml:space="preserve"> </w:t>
+      </w:r>
+      <w:r>
+        <w:t xml:space="preserve">1.29–2.30× faster across the full panel with comparable F1 on</w:t>
+      </w:r>
+      <w:r>
+        <w:t xml:space="preserve"> </w:t>
+      </w:r>
+      <w:r>
+        <w:t xml:space="preserve">high-host samples (maximum difference 0.00033) and zero host carry-over</w:t>
+      </w:r>
+      <w:r>
+        <w:t xml:space="preserve"> </w:t>
+      </w:r>
+      <w:r>
+        <w:t xml:space="preserve">where verification fires;</w:t>
+      </w:r>
+      <w:r>
+        <w:t xml:space="preserve"> </w:t>
+      </w:r>
+      <w:r>
+        <w:t xml:space="preserve">fastp + Hostile retains 0.17–0.68% host (Table 2). KneadData, meanwhile,</w:t>
+      </w:r>
+      <w:r>
+        <w:t xml:space="preserve"> </w:t>
+      </w:r>
+      <w:r>
+        <w:t xml:space="preserve">retains the lowest reported single-process memory footprint in our</w:t>
+      </w:r>
+      <w:r>
+        <w:t xml:space="preserve"> </w:t>
+      </w:r>
+      <w:r>
+        <w:t xml:space="preserve">benchmark (1.11 GiB); the AUTO advantage is accuracy, verification and</w:t>
+      </w:r>
+      <w:r>
+        <w:t xml:space="preserve"> </w:t>
+      </w:r>
+      <w:r>
+        <w:t xml:space="preserve">carry-over at 4.54 GiB —</w:t>
       </w:r>
       <w:r>
         <w:t xml:space="preserve"> </w:t>
@@ -8272,7 +8604,7 @@
         <w:t xml:space="preserve"> </w:t>
       </w:r>
       <w:r>
-        <w:t xml:space="preserve">factor (~2×), far smaller than the observed 44–130× gap for the deacon</w:t>
+        <w:t xml:space="preserve">factor (~2×), far smaller than the observed 41–130× gap for the deacon</w:t>
       </w:r>
       <w:r>
         <w:t xml:space="preserve"> </w:t>
@@ -8281,8 +8613,8 @@
         <w:t xml:space="preserve">depletion step, but we note the asymmetry for completeness.</w:t>
       </w:r>
     </w:p>
-    <w:bookmarkEnd w:id="44"/>
-    <w:bookmarkStart w:id="45" w:name="software-and-data-availability"/>
+    <w:bookmarkEnd w:id="41"/>
+    <w:bookmarkStart w:id="42" w:name="software-and-data-availability"/>
     <w:p>
       <w:pPr>
         <w:pStyle w:val="Heading2"/>
@@ -8347,8 +8679,8 @@
         <w:t xml:space="preserve">original data-access agreements.</w:t>
       </w:r>
     </w:p>
-    <w:bookmarkEnd w:id="45"/>
-    <w:bookmarkStart w:id="48" w:name="X5e7fc9a2bba330cc343b13bfe4d5c9bdb134d21"/>
+    <w:bookmarkEnd w:id="42"/>
+    <w:bookmarkStart w:id="45" w:name="X5e7fc9a2bba330cc343b13bfe4d5c9bdb134d21"/>
     <w:p>
       <w:pPr>
         <w:pStyle w:val="Heading2"/>
@@ -8371,7 +8703,7 @@
         <w:t xml:space="preserve">converted to a cover letter before submission.]</w:t>
       </w:r>
     </w:p>
-    <w:bookmarkStart w:id="46" w:name="suggested-target-venues"/>
+    <w:bookmarkStart w:id="43" w:name="suggested-target-venues"/>
     <w:p>
       <w:pPr>
         <w:pStyle w:val="Heading3"/>
@@ -8574,8 +8906,8 @@
         <w:t xml:space="preserve">good matches.</w:t>
       </w:r>
     </w:p>
-    <w:bookmarkEnd w:id="46"/>
-    <w:bookmarkStart w:id="47" w:name="Xe4ce7175756d72f51ca3648006be2d8103f8e26"/>
+    <w:bookmarkEnd w:id="43"/>
+    <w:bookmarkStart w:id="44" w:name="Xe4ce7175756d72f51ca3648006be2d8103f8e26"/>
     <w:p>
       <w:pPr>
         <w:pStyle w:val="Heading3"/>
@@ -8722,7 +9054,7 @@
               <w:pStyle w:val="Compact"/>
             </w:pPr>
             <w:r>
-              <w:t xml:space="preserve">KneadData runs at 100 M reads cost ~4 h each, so the panel concentrates on the host-fraction and depth range that spans the practical use cases (1–90% host, 5–100 M reads). The cross-species panel and the real-data cohort extend generalisability beyond it.</w:t>
+              <w:t xml:space="preserve">The six datasets span the practical host-fraction and depth range (1–90% host, 5–100 M reads). All four tools are reported for all six datasets; 100M comparator arms use single runs because KneadData costs ~2–4 h per run. The cross-species panel and the real-data cohort extend generalisability beyond it.</w:t>
             </w:r>
           </w:p>
         </w:tc>
@@ -8917,7 +9249,7 @@
               <w:pStyle w:val="Compact"/>
             </w:pPr>
             <w:r>
-              <w:t xml:space="preserve">RustyClean integrates QC, adaptive verification (0.0035–0.0042% → 0.0000% host carry on high-host samples), pan-host index support, checkpointing, validation, and bounded concurrency in one binary; on the panel the full pipeline is 1.3–2.3× faster than fastp + Hostile with equal-or-better F1 and zero carry-over (Section 3.1). deacon alone lacks the verification tier, QC and orchestration (Discussion).</w:t>
+              <w:t xml:space="preserve">RustyClean integrates QC, adaptive verification (0.0035–0.0042% → 0.0000% host carry on high-host samples), pan-host index support, checkpointing, validation, and bounded concurrency in one binary; across the six-dataset panel the full pipeline is 1.29–2.30× faster than fastp + Hostile with zero high-host carry-over and comparable-or-better F1 (Section 3.1). deacon alone lacks the verification tier, QC and orchestration (Discussion).</w:t>
             </w:r>
           </w:p>
         </w:tc>
@@ -8956,27 +9288,15 @@
               <w:pStyle w:val="Compact"/>
             </w:pPr>
             <w:r>
-              <w:t xml:space="preserve">It is the fastest available engine by an order of magnitude and we replicate its reported behaviour on an independent panel with pinned v0.17.0. Alternative peer-reviewed backends (Bowtie2, minimap2, Kraken2) remain selectable via</w:t>
-            </w:r>
-            <w:r>
-              <w:t xml:space="preserve"> </w:t>
-            </w:r>
-            <w:r>
-              <w:rPr>
-                <w:rStyle w:val="VerbatimChar"/>
-              </w:rPr>
-              <w:t xml:space="preserve">--host-removal-mode</w:t>
-            </w:r>
-            <w:r>
-              <w:t xml:space="preserve">, so the pipeline does not hard-depend on deacon (Sections 2.1 and 3.5).</w:t>
+              <w:t xml:space="preserve">It is the fastest available engine by an order of magnitude and we replicate its reported behaviour on an independent panel with pinned v0.17.0. Alternative peer-reviewed backends were benchmarked in a separate pre-simplification research build; the streamlined production CLI is intentionally deacon/AUTO-focused (Sections 2.1 and 3.5).</w:t>
             </w:r>
           </w:p>
         </w:tc>
       </w:tr>
     </w:tbl>
-    <w:bookmarkEnd w:id="47"/>
-    <w:bookmarkEnd w:id="48"/>
-    <w:bookmarkStart w:id="49" w:name="references"/>
+    <w:bookmarkEnd w:id="44"/>
+    <w:bookmarkEnd w:id="45"/>
+    <w:bookmarkStart w:id="46" w:name="references"/>
     <w:p>
       <w:pPr>
         <w:pStyle w:val="Heading2"/>
@@ -9282,8 +9602,8 @@
         <w:t xml:space="preserve">doi:10.1101/2025.06.09.658732. Preprint: not peer reviewed.</w:t>
       </w:r>
     </w:p>
-    <w:bookmarkEnd w:id="49"/>
-    <w:bookmarkStart w:id="53" w:name="supplementary-material"/>
+    <w:bookmarkEnd w:id="46"/>
+    <w:bookmarkStart w:id="50" w:name="supplementary-material"/>
     <w:p>
       <w:pPr>
         <w:pStyle w:val="Heading2"/>
@@ -9301,18 +9621,18 @@
           <wp:inline>
             <wp:extent cx="5334000" cy="5334000"/>
             <wp:effectExtent b="0" l="0" r="0" t="0"/>
-            <wp:docPr descr="" title="" id="51" name="Picture"/>
+            <wp:docPr descr="" title="" id="48" name="Picture"/>
             <a:graphic>
               <a:graphicData uri="http://schemas.openxmlformats.org/drawingml/2006/picture">
                 <pic:pic>
                   <pic:nvPicPr>
-                    <pic:cNvPr descr="figures/figS1_backend_comparison.png" id="52" name="Picture"/>
+                    <pic:cNvPr descr="figures/figS1_backend_comparison.png" id="49" name="Picture"/>
                     <pic:cNvPicPr>
                       <a:picLocks noChangeArrowheads="1" noChangeAspect="1"/>
                     </pic:cNvPicPr>
                   </pic:nvPicPr>
                   <pic:blipFill>
-                    <a:blip r:embed="rId50"/>
+                    <a:blip r:embed="rId47"/>
                     <a:stretch>
                       <a:fillRect/>
                     </a:stretch>
@@ -10389,13 +10709,13 @@
         <w:t xml:space="preserve"> </w:t>
       </w:r>
       <w:r>
-        <w:t xml:space="preserve">The machine-readable tables behind</w:t>
-      </w:r>
-      <w:r>
-        <w:t xml:space="preserve"> </w:t>
-      </w:r>
-      <w:r>
-        <w:t xml:space="preserve">the deacon-based evaluation are available under</w:t>
+        <w:t xml:space="preserve">Per-figure summary tables used</w:t>
+      </w:r>
+      <w:r>
+        <w:t xml:space="preserve"> </w:t>
+      </w:r>
+      <w:r>
+        <w:t xml:space="preserve">directly by the plotting code are under</w:t>
       </w:r>
       <w:r>
         <w:t xml:space="preserve"> </w:t>
@@ -10404,10 +10724,16 @@
         <w:rPr>
           <w:rStyle w:val="VerbatimChar"/>
         </w:rPr>
-        <w:t xml:space="preserve">data/deacon_panel/</w:t>
-      </w:r>
-      <w:r>
-        <w:t xml:space="preserve">:</w:t>
+        <w:t xml:space="preserve">data/main_figures/</w:t>
+      </w:r>
+      <w:r>
+        <w:t xml:space="preserve">. Replicate-</w:t>
+      </w:r>
+      <w:r>
+        <w:t xml:space="preserve"> </w:t>
+      </w:r>
+      <w:r>
+        <w:t xml:space="preserve">and comparator-level source tables are under</w:t>
       </w:r>
       <w:r>
         <w:t xml:space="preserve"> </w:t>
@@ -10416,13 +10742,10 @@
         <w:rPr>
           <w:rStyle w:val="VerbatimChar"/>
         </w:rPr>
-        <w:t xml:space="preserve">five_way_summary.csv</w:t>
-      </w:r>
-      <w:r>
-        <w:t xml:space="preserve"> </w:t>
-      </w:r>
-      <w:r>
-        <w:t xml:space="preserve">(the four-way means of Table 2),</w:t>
+        <w:t xml:space="preserve">runs/deacon_panel/metrics/</w:t>
+      </w:r>
+      <w:r>
+        <w:t xml:space="preserve">:</w:t>
       </w:r>
       <w:r>
         <w:t xml:space="preserve"> </w:t>
@@ -10467,19 +10790,34 @@
         <w:rPr>
           <w:rStyle w:val="VerbatimChar"/>
         </w:rPr>
+        <w:t xml:space="preserve">fill_100m_comparators.csv</w:t>
+      </w:r>
+      <w:r>
+        <w:t xml:space="preserve"> </w:t>
+      </w:r>
+      <w:r>
+        <w:t xml:space="preserve">(single-run KneadData and</w:t>
+      </w:r>
+      <w:r>
+        <w:t xml:space="preserve"> </w:t>
+      </w:r>
+      <w:r>
+        <w:t xml:space="preserve">fastp + Hostile 100M measurements),</w:t>
+      </w:r>
+      <w:r>
+        <w:t xml:space="preserve"> </w:t>
+      </w:r>
+      <w:r>
+        <w:rPr>
+          <w:rStyle w:val="VerbatimChar"/>
+        </w:rPr>
         <w:t xml:space="preserve">cross_species_metrics.csv</w:t>
       </w:r>
       <w:r>
         <w:t xml:space="preserve"> </w:t>
       </w:r>
       <w:r>
-        <w:t xml:space="preserve">(per-species index runs behind</w:t>
-      </w:r>
-      <w:r>
-        <w:t xml:space="preserve"> </w:t>
-      </w:r>
-      <w:r>
-        <w:t xml:space="preserve">Table 3 and Figure 4),</w:t>
+        <w:t xml:space="preserve">(per-species index runs behind Table 3 and Figure 3),</w:t>
       </w:r>
       <w:r>
         <w:t xml:space="preserve"> </w:t>
@@ -10494,13 +10832,13 @@
         <w:t xml:space="preserve"> </w:t>
       </w:r>
       <w:r>
-        <w:t xml:space="preserve">(species-matched index</w:t>
-      </w:r>
-      <w:r>
-        <w:t xml:space="preserve"> </w:t>
-      </w:r>
-      <w:r>
-        <w:t xml:space="preserve">build time, memory and size), and</w:t>
+        <w:t xml:space="preserve">(species-matched index build time, memory and</w:t>
+      </w:r>
+      <w:r>
+        <w:t xml:space="preserve"> </w:t>
+      </w:r>
+      <w:r>
+        <w:t xml:space="preserve">size), and</w:t>
       </w:r>
       <w:r>
         <w:t xml:space="preserve"> </w:t>
@@ -10515,32 +10853,11 @@
         <w:t xml:space="preserve"> </w:t>
       </w:r>
       <w:r>
-        <w:t xml:space="preserve">with the</w:t>
-      </w:r>
-      <w:r>
-        <w:t xml:space="preserve"> </w:t>
-      </w:r>
-      <w:r>
-        <w:t xml:space="preserve">per-worker RSS samples under</w:t>
-      </w:r>
-      <w:r>
-        <w:t xml:space="preserve"> </w:t>
-      </w:r>
-      <w:r>
-        <w:rPr>
-          <w:rStyle w:val="VerbatimChar"/>
-        </w:rPr>
-        <w:t xml:space="preserve">parscale/</w:t>
-      </w:r>
-      <w:r>
-        <w:t xml:space="preserve"> </w:t>
-      </w:r>
-      <w:r>
-        <w:t xml:space="preserve">(Figure 5).</w:t>
-      </w:r>
-    </w:p>
-    <w:bookmarkEnd w:id="53"/>
-    <w:bookmarkEnd w:id="54"/>
+        <w:t xml:space="preserve">(Figure 4 scaling summary).</w:t>
+      </w:r>
+    </w:p>
+    <w:bookmarkEnd w:id="50"/>
+    <w:bookmarkEnd w:id="51"/>
     <w:sectPr>
       <w:footnotePr>
         <w:numRestart w:val="eachSect"/>

</xml_diff>